<commit_message>
Revise RL control report: paper-style overview and perception figures, verified structures
- Overview and perception figures follow the PRISM paper layout
- MATE-GRU figure annotated with sub-network layer widths
- Corrected proprio MLP, flag token, pooling scale and sampler details against source
- Added training-only sub-network table; removed reference list

Co-Authored-By: Claude Opus 5.5 <noreply@anthropic.com>
Claude-Session: https://claude.ai/code/session_01Vjek2i5ip6LVUUhychteor
</commit_message>
<xml_diff>
--- a/report_rl_control/强化学习运动控制_技术报告.docx
+++ b/report_rl_control/强化学习运动控制_技术报告.docx
@@ -2,7 +2,7 @@
 <file path=word/document.xml><?xml version="1.0" encoding="utf-8"?>
 <w:document xmlns:w="http://schemas.openxmlformats.org/wordprocessingml/2006/main" xmlns:m="http://schemas.openxmlformats.org/officeDocument/2006/math" xmlns:r="http://schemas.openxmlformats.org/officeDocument/2006/relationships" xmlns:o="urn:schemas-microsoft-com:office:office" xmlns:v="urn:schemas-microsoft-com:vml" xmlns:w10="urn:schemas-microsoft-com:office:word" xmlns:a="http://schemas.openxmlformats.org/drawingml/2006/main" xmlns:pic="http://schemas.openxmlformats.org/drawingml/2006/picture" xmlns:wp="http://schemas.openxmlformats.org/drawingml/2006/wordprocessingDrawing">
   <w:body>
-    <w:bookmarkStart w:id="44" w:name="基于强化学习的运动控制"/>
+    <w:bookmarkStart w:id="43" w:name="基于强化学习的运动控制"/>
     <w:p>
       <w:pPr>
         <w:pStyle w:val="Heading1"/>
@@ -16,7 +16,7 @@
         <w:pStyle w:val="FirstParagraph"/>
       </w:pPr>
       <w:r>
-        <w:t xml:space="preserve">四足机器人在月面巡视时会遇到坡面、台阶、沟槽、碎石等多种地形，地形之间切换频繁，单一步态或手工设计的控制器很难全部覆盖。本项目的腿部运动控制采用端到端的深度强化学习方法，在PRISM框架[1]的基础上，针对本机器人（12个腿部关节，背负RM75机械臂）重新设计了观测接口、网络规模和训练配置。控制器直接以深度图像和本体感知为输入，输出12个腿部关节的目标位置，再由底层PD控制器转换为关节力矩。训练在Isaac Gym中进行[2,3]，算法为近端策略优化（PPO）[4]。</w:t>
+        <w:t xml:space="preserve">四足机器人在月面巡视时会遇到坡面、台阶、沟槽、碎石等多种地形，地形之间切换频繁，单一步态或手工设计的控制器很难全部覆盖。本项目的腿部运动控制采用端到端的深度强化学习方法，参考PRISM方法的整体框架，针对本机器人（12个腿部关节，背负RM75机械臂）重新设计了观测接口、网络规模和训练配置。控制器直接以深度图像和本体感知为输入，输出12个腿部关节的目标位置，再由底层PD控制器转换为关节力矩。训练在Isaac Gym仿真平台中进行，强化学习算法为近端策略优化（PPO）。</w:t>
       </w:r>
     </w:p>
     <w:p>
@@ -24,7 +24,7 @@
         <w:pStyle w:val="BodyText"/>
       </w:pPr>
       <w:r>
-        <w:t xml:space="preserve">本章先介绍整体架构，然后按数据流的顺序依次说明视觉感知与融合模块、读写记忆估计器、混合专家策略网络和底层执行，最后介绍训练流程与部署推理方式。</w:t>
+        <w:t xml:space="preserve">本章先介绍整体架构，然后按数据流的顺序依次说明视觉感知与跨模态融合、读写记忆估计器、混合专家策略网络和底层执行，最后介绍训练流程与部署推理方式。</w:t>
       </w:r>
     </w:p>
     <w:bookmarkStart w:id="23" w:name="整体架构"/>
@@ -41,7 +41,7 @@
         <w:pStyle w:val="FirstParagraph"/>
       </w:pPr>
       <w:r>
-        <w:t xml:space="preserve">控制问题可以看作一个部分可观测马尔可夫决策过程：策略只能看到机载传感器提供的信息，地形高度、足端接触力、真实机身速度等量在实机上无法直接测量。为了在信息不完整的条件下做出合理决策，网络需要从历史观测和深度图像中把这些隐藏状态估计出来。基于这个思路，整个控制器分为三个部分，结构如图1所示。</w:t>
+        <w:t xml:space="preserve">控制问题可以看作一个部分可观测马尔可夫决策过程：策略只能看到机载传感器提供的信息，地形高度、足端接触力、真实机身速度等量在实机上无法直接测量。为了在信息不完整的条件下做出合理决策，网络需要从历史观测和深度图像中把这些隐藏状态估计出来。基于这个思路，整个控制器的结构如图1所示。</w:t>
       </w:r>
     </w:p>
     <w:p>
@@ -51,9 +51,9 @@
       <w:r>
         <w:drawing>
           <wp:inline>
-            <wp:extent cx="5753100" cy="2690966"/>
+            <wp:extent cx="5753100" cy="2237316"/>
             <wp:effectExtent b="0" l="0" r="0" t="0"/>
-            <wp:docPr descr="图1 强化学习运动控制器整体架构" title="" id="21" name="Picture"/>
+            <wp:docPr descr="图1 强化学习运动控制器整体框架" title="" id="21" name="Picture"/>
             <a:graphic>
               <a:graphicData uri="http://schemas.openxmlformats.org/drawingml/2006/picture">
                 <pic:pic>
@@ -72,7 +72,7 @@
                   <pic:spPr bwMode="auto">
                     <a:xfrm>
                       <a:off x="0" y="0"/>
-                      <a:ext cx="5753100" cy="2690966"/>
+                      <a:ext cx="5753100" cy="2237316"/>
                     </a:xfrm>
                     <a:prstGeom prst="rect">
                       <a:avLst/>
@@ -96,7 +96,7 @@
         <w:pStyle w:val="ImageCaption"/>
       </w:pPr>
       <w:r>
-        <w:t xml:space="preserve">图1 强化学习运动控制器整体架构</w:t>
+        <w:t xml:space="preserve">图1 强化学习运动控制器整体框架</w:t>
       </w:r>
     </w:p>
     <w:p>
@@ -104,7 +104,58 @@
         <w:pStyle w:val="BodyText"/>
       </w:pPr>
       <w:r>
-        <w:t xml:space="preserve">第一部分是视觉感知与跨模态融合模块。深度图先经过卷积网络编码为一组局部视觉token，再由主动采样从中挑出16个位置的特征；最近10帧本体观测经过MLP编码为10个本体token。两类token连同视觉标志token一起送入Transformer融合，输出10个已经吸收了地形信息的本体特征</w:t>
+        <w:t xml:space="preserve">深度图</w:t>
+      </w:r>
+      <w:r>
+        <w:t xml:space="preserve"> </w:t>
+      </w:r>
+      <m:oMath>
+        <m:sSub>
+          <m:e>
+            <m:r>
+              <m:t>D</m:t>
+            </m:r>
+          </m:e>
+          <m:sub>
+            <m:r>
+              <m:t>t</m:t>
+            </m:r>
+          </m:sub>
+        </m:sSub>
+      </m:oMath>
+      <w:r>
+        <w:t xml:space="preserve"> </w:t>
+      </w:r>
+      <w:r>
+        <w:t xml:space="preserve">先进入视觉感知模块，被编码为局部视觉token，并由主动采样从中取出16个位置的特征；最近10帧本体观测</w:t>
+      </w:r>
+      <w:r>
+        <w:t xml:space="preserve"> </w:t>
+      </w:r>
+      <m:oMath>
+        <m:sSubSup>
+          <m:e>
+            <m:r>
+              <m:t>O</m:t>
+            </m:r>
+          </m:e>
+          <m:sub>
+            <m:r>
+              <m:t>t</m:t>
+            </m:r>
+          </m:sub>
+          <m:sup>
+            <m:r>
+              <m:t>10</m:t>
+            </m:r>
+          </m:sup>
+        </m:sSubSup>
+      </m:oMath>
+      <w:r>
+        <w:t xml:space="preserve"> </w:t>
+      </w:r>
+      <w:r>
+        <w:t xml:space="preserve">经本体MLP逐帧编码为10个本体token。两类token与1个视觉标志token排成一列，共27个，送入跨模态Transformer融合，取输出中10个本体位置的特征记为</w:t>
       </w:r>
       <w:r>
         <w:t xml:space="preserve"> </w:t>
@@ -132,7 +183,7 @@
         <w:pStyle w:val="BodyText"/>
       </w:pPr>
       <w:r>
-        <w:t xml:space="preserve">第二部分是读写记忆估计器，参考PRISM中MATE-GRU[1]的思路实现。它一方面用运动GRU估计机身速度和足端高度，另一方面用3个读写记忆专家维护一个64维的共享状态</w:t>
+        <w:t xml:space="preserve">读写记忆估计器以</w:t>
       </w:r>
       <w:r>
         <w:t xml:space="preserve"> </w:t>
@@ -141,7 +192,7 @@
         <m:sSub>
           <m:e>
             <m:r>
-              <m:t>s</m:t>
+              <m:t>X</m:t>
             </m:r>
           </m:e>
           <m:sub>
@@ -152,7 +203,30 @@
         </m:sSub>
       </m:oMath>
       <w:r>
-        <w:t xml:space="preserve">，用来记住机器人走过的地形。估计器最终输出69维的控制码</w:t>
+        <w:t xml:space="preserve"> </w:t>
+      </w:r>
+      <w:r>
+        <w:t xml:space="preserve">为输入，结构参考PRISM中的MATE-GRU。它一方面用运动GRU估计机身速度和足端高度，另一方面用3个读写记忆专家维护一个64维的共享状态</w:t>
+      </w:r>
+      <w:r>
+        <w:t xml:space="preserve"> </w:t>
+      </w:r>
+      <m:oMath>
+        <m:sSub>
+          <m:e>
+            <m:r>
+              <m:t>s</m:t>
+            </m:r>
+          </m:e>
+          <m:sub>
+            <m:r>
+              <m:t>t</m:t>
+            </m:r>
+          </m:sub>
+        </m:sSub>
+      </m:oMath>
+      <w:r>
+        <w:t xml:space="preserve">，用来记住机器人走过的地形。估计器的各个输出拼成69维的控制码</w:t>
       </w:r>
       <w:r>
         <w:t xml:space="preserve"> </w:t>
@@ -176,7 +250,132 @@
         </m:sSub>
       </m:oMath>
       <w:r>
-        <w:t xml:space="preserve">。</w:t>
+        <w:t xml:space="preserve">，其中</w:t>
+      </w:r>
+      <w:r>
+        <w:t xml:space="preserve"> </w:t>
+      </w:r>
+      <m:oMath>
+        <m:sSubSup>
+          <m:e>
+            <m:r>
+              <m:t>z</m:t>
+            </m:r>
+          </m:e>
+          <m:sub>
+            <m:r>
+              <m:t>t</m:t>
+            </m:r>
+          </m:sub>
+          <m:sup>
+            <m:r>
+              <m:t>μ</m:t>
+            </m:r>
+          </m:sup>
+        </m:sSubSup>
+      </m:oMath>
+      <w:r>
+        <w:t xml:space="preserve"> </w:t>
+      </w:r>
+      <w:r>
+        <w:t xml:space="preserve">和</w:t>
+      </w:r>
+      <w:r>
+        <w:t xml:space="preserve"> </w:t>
+      </w:r>
+      <m:oMath>
+        <m:sSubSup>
+          <m:e>
+            <m:r>
+              <m:t>z</m:t>
+            </m:r>
+          </m:e>
+          <m:sub>
+            <m:r>
+              <m:t>t</m:t>
+            </m:r>
+          </m:sub>
+          <m:sup>
+            <m:r>
+              <m:t>t</m:t>
+            </m:r>
+            <m:r>
+              <m:t>m</m:t>
+            </m:r>
+          </m:sup>
+        </m:sSubSup>
+      </m:oMath>
+      <w:r>
+        <w:t xml:space="preserve"> </w:t>
+      </w:r>
+      <w:r>
+        <w:t xml:space="preserve">在训练时还分别接解码器预测下一时刻观测</w:t>
+      </w:r>
+      <w:r>
+        <w:t xml:space="preserve"> </w:t>
+      </w:r>
+      <m:oMath>
+        <m:sSub>
+          <m:e>
+            <m:acc>
+              <m:accPr>
+                <m:chr m:val="̂"/>
+              </m:accPr>
+              <m:e>
+                <m:r>
+                  <m:t>o</m:t>
+                </m:r>
+              </m:e>
+            </m:acc>
+          </m:e>
+          <m:sub>
+            <m:r>
+              <m:t>t</m:t>
+            </m:r>
+            <m:r>
+              <m:rPr>
+                <m:sty m:val="p"/>
+              </m:rPr>
+              <m:t>+</m:t>
+            </m:r>
+            <m:r>
+              <m:t>1</m:t>
+            </m:r>
+          </m:sub>
+        </m:sSub>
+      </m:oMath>
+      <w:r>
+        <w:t xml:space="preserve"> </w:t>
+      </w:r>
+      <w:r>
+        <w:t xml:space="preserve">和局部高度图</w:t>
+      </w:r>
+      <w:r>
+        <w:t xml:space="preserve"> </w:t>
+      </w:r>
+      <m:oMath>
+        <m:sSub>
+          <m:e>
+            <m:acc>
+              <m:accPr>
+                <m:chr m:val="̂"/>
+              </m:accPr>
+              <m:e>
+                <m:r>
+                  <m:t>m</m:t>
+                </m:r>
+              </m:e>
+            </m:acc>
+          </m:e>
+          <m:sub>
+            <m:r>
+              <m:t>t</m:t>
+            </m:r>
+          </m:sub>
+        </m:sSub>
+      </m:oMath>
+      <w:r>
+        <w:t xml:space="preserve">，部署时这两路不运行。</w:t>
       </w:r>
     </w:p>
     <w:p>
@@ -184,7 +383,7 @@
         <w:pStyle w:val="BodyText"/>
       </w:pPr>
       <w:r>
-        <w:t xml:space="preserve">第三部分是混合专家策略网络。它把当前观测、控制码和视觉标志拼接成115维输入，由8个动作专家分别给出动作建议，再按门控权重加权得到最终动作</w:t>
+        <w:t xml:space="preserve">混合专家Actor把控制码、视觉标志和当前观测拼接成115维输入，由8个动作专家分别给出动作建议，再按门控权重加权得到动作</w:t>
       </w:r>
       <w:r>
         <w:t xml:space="preserve"> </w:t>
@@ -204,7 +403,64 @@
         </m:sSub>
       </m:oMath>
       <w:r>
-        <w:t xml:space="preserve">。训练时另有一个非对称Critic读取仿真中的特权信息，用来估计状态价值，部署时不需要它。</w:t>
+        <w:t xml:space="preserve">，经PD控制器作用到仿真环境或实机上。训练时另有一个非对称Critic读取仿真中的特权信息</w:t>
+      </w:r>
+      <w:r>
+        <w:t xml:space="preserve"> </w:t>
+      </w:r>
+      <m:oMath>
+        <m:sSubSup>
+          <m:e>
+            <m:r>
+              <m:t>x</m:t>
+            </m:r>
+          </m:e>
+          <m:sub>
+            <m:r>
+              <m:t>t</m:t>
+            </m:r>
+          </m:sub>
+          <m:sup>
+            <m:r>
+              <m:t>p</m:t>
+            </m:r>
+            <m:r>
+              <m:t>r</m:t>
+            </m:r>
+            <m:r>
+              <m:t>i</m:t>
+            </m:r>
+            <m:r>
+              <m:t>v</m:t>
+            </m:r>
+          </m:sup>
+        </m:sSubSup>
+      </m:oMath>
+      <w:r>
+        <w:t xml:space="preserve">，给出状态价值</w:t>
+      </w:r>
+      <w:r>
+        <w:t xml:space="preserve"> </w:t>
+      </w:r>
+      <m:oMath>
+        <m:sSub>
+          <m:e>
+            <m:r>
+              <m:t>V</m:t>
+            </m:r>
+          </m:e>
+          <m:sub>
+            <m:r>
+              <m:t>t</m:t>
+            </m:r>
+          </m:sub>
+        </m:sSub>
+      </m:oMath>
+      <w:r>
+        <w:t xml:space="preserve"> </w:t>
+      </w:r>
+      <w:r>
+        <w:t xml:space="preserve">用于PPO更新，部署时不需要它。</w:t>
       </w:r>
     </w:p>
     <w:p>
@@ -212,12 +468,13 @@
         <w:pStyle w:val="BodyText"/>
       </w:pPr>
       <w:r>
-        <w:t xml:space="preserve">几个模块的运行频率不同。策略网络每20 ms执行一次（50 Hz），深度相机和估计器大约每100 ms刷新一次（10 Hz），估计器不刷新的周期里策略直接复用上一次的控制码。各模块的主要接口见表1。</w:t>
+        <w:t xml:space="preserve">几个模块的运行频率不同。Actor每20 ms执行一次（50 Hz），深度相机和估计器大约每100 ms刷新一次（10 Hz），估计器不刷新的周期里Actor直接复用上一次的控制码。各模块的主要接口见表1。</w:t>
       </w:r>
     </w:p>
     <w:p>
       <w:pPr>
         <w:pStyle w:val="TableCaption"/>
+        <w:keepNext/>
       </w:pPr>
       <w:r>
         <w:t xml:space="preserve">表1 控制器主要输入输出</w:t>
@@ -257,6 +514,7 @@
           <w:p>
             <w:pPr>
               <w:pStyle w:val="Compact"/>
+              <w:keepNext/>
               <w:ind w:firstLine="0"/>
               <w:jc w:val="left"/>
             </w:pPr>
@@ -278,6 +536,7 @@
           <w:p>
             <w:pPr>
               <w:pStyle w:val="Compact"/>
+              <w:keepNext/>
               <w:ind w:firstLine="0"/>
               <w:jc w:val="left"/>
             </w:pPr>
@@ -299,6 +558,7 @@
           <w:p>
             <w:pPr>
               <w:pStyle w:val="Compact"/>
+              <w:keepNext/>
               <w:ind w:firstLine="0"/>
               <w:jc w:val="left"/>
             </w:pPr>
@@ -318,6 +578,7 @@
           <w:p>
             <w:pPr>
               <w:pStyle w:val="Compact"/>
+              <w:keepNext/>
               <w:ind w:firstLine="0"/>
               <w:jc w:val="left"/>
             </w:pPr>
@@ -354,6 +615,7 @@
           <w:p>
             <w:pPr>
               <w:pStyle w:val="Compact"/>
+              <w:keepNext/>
               <w:ind w:firstLine="0"/>
               <w:jc w:val="left"/>
             </w:pPr>
@@ -370,6 +632,7 @@
           <w:p>
             <w:pPr>
               <w:pStyle w:val="Compact"/>
+              <w:keepNext/>
               <w:ind w:firstLine="0"/>
               <w:jc w:val="left"/>
             </w:pPr>
@@ -388,6 +651,7 @@
           <w:p>
             <w:pPr>
               <w:pStyle w:val="Compact"/>
+              <w:keepNext/>
               <w:ind w:firstLine="0"/>
               <w:jc w:val="left"/>
             </w:pPr>
@@ -404,7 +668,7 @@
               <w:t xml:space="preserve"> </w:t>
             </w:r>
             <m:oMath>
-              <m:sSub>
+              <m:sSubSup>
                 <m:e>
                   <m:r>
                     <m:t>O</m:t>
@@ -415,7 +679,12 @@
                     <m:t>t</m:t>
                   </m:r>
                 </m:sub>
-              </m:sSub>
+                <m:sup>
+                  <m:r>
+                    <m:t>10</m:t>
+                  </m:r>
+                </m:sup>
+              </m:sSubSup>
             </m:oMath>
           </w:p>
         </w:tc>
@@ -424,6 +693,7 @@
           <w:p>
             <w:pPr>
               <w:pStyle w:val="Compact"/>
+              <w:keepNext/>
               <w:ind w:firstLine="0"/>
               <w:jc w:val="left"/>
             </w:pPr>
@@ -440,6 +710,7 @@
           <w:p>
             <w:pPr>
               <w:pStyle w:val="Compact"/>
+              <w:keepNext/>
               <w:ind w:firstLine="0"/>
               <w:jc w:val="left"/>
             </w:pPr>
@@ -484,6 +755,7 @@
           <w:p>
             <w:pPr>
               <w:pStyle w:val="Compact"/>
+              <w:keepNext/>
               <w:ind w:firstLine="0"/>
               <w:jc w:val="left"/>
             </w:pPr>
@@ -520,6 +792,7 @@
           <w:p>
             <w:pPr>
               <w:pStyle w:val="Compact"/>
+              <w:keepNext/>
               <w:ind w:firstLine="0"/>
               <w:jc w:val="left"/>
             </w:pPr>
@@ -536,6 +809,7 @@
           <w:p>
             <w:pPr>
               <w:pStyle w:val="Compact"/>
+              <w:keepNext/>
               <w:ind w:firstLine="0"/>
               <w:jc w:val="left"/>
             </w:pPr>
@@ -554,6 +828,7 @@
           <w:p>
             <w:pPr>
               <w:pStyle w:val="Compact"/>
+              <w:keepNext/>
               <w:ind w:firstLine="0"/>
               <w:jc w:val="left"/>
             </w:pPr>
@@ -590,6 +865,7 @@
           <w:p>
             <w:pPr>
               <w:pStyle w:val="Compact"/>
+              <w:keepNext/>
               <w:ind w:firstLine="0"/>
               <w:jc w:val="left"/>
             </w:pPr>
@@ -606,6 +882,7 @@
           <w:p>
             <w:pPr>
               <w:pStyle w:val="Compact"/>
+              <w:keepNext/>
               <w:ind w:firstLine="0"/>
               <w:jc w:val="left"/>
             </w:pPr>
@@ -624,6 +901,7 @@
           <w:p>
             <w:pPr>
               <w:pStyle w:val="Compact"/>
+              <w:keepNext/>
               <w:ind w:firstLine="0"/>
               <w:jc w:val="left"/>
             </w:pPr>
@@ -664,6 +942,7 @@
           <w:p>
             <w:pPr>
               <w:pStyle w:val="Compact"/>
+              <w:keepNext/>
               <w:ind w:firstLine="0"/>
               <w:jc w:val="left"/>
             </w:pPr>
@@ -680,6 +959,7 @@
           <w:p>
             <w:pPr>
               <w:pStyle w:val="Compact"/>
+              <w:keepNext/>
               <w:ind w:firstLine="0"/>
               <w:jc w:val="left"/>
             </w:pPr>
@@ -698,6 +978,7 @@
           <w:p>
             <w:pPr>
               <w:pStyle w:val="Compact"/>
+              <w:keepNext/>
               <w:ind w:firstLine="0"/>
               <w:jc w:val="left"/>
             </w:pPr>
@@ -734,6 +1015,7 @@
           <w:p>
             <w:pPr>
               <w:pStyle w:val="Compact"/>
+              <w:keepNext/>
               <w:ind w:firstLine="0"/>
               <w:jc w:val="left"/>
             </w:pPr>
@@ -750,6 +1032,7 @@
           <w:p>
             <w:pPr>
               <w:pStyle w:val="Compact"/>
+              <w:keepNext/>
               <w:ind w:firstLine="0"/>
               <w:jc w:val="left"/>
             </w:pPr>
@@ -797,11 +1080,16 @@
                 </m:sub>
                 <m:sup>
                   <m:r>
-                    <m:rPr>
-                      <m:nor/>
-                      <m:sty m:val="p"/>
-                    </m:rPr>
-                    <m:t>priv</m:t>
+                    <m:t>p</m:t>
+                  </m:r>
+                  <m:r>
+                    <m:t>r</m:t>
+                  </m:r>
+                  <m:r>
+                    <m:t>i</m:t>
+                  </m:r>
+                  <m:r>
+                    <m:t>v</m:t>
                   </m:r>
                 </m:sup>
               </m:sSubSup>
@@ -1230,7 +1518,7 @@
         <w:pStyle w:val="FirstParagraph"/>
       </w:pPr>
       <w:r>
-        <w:t xml:space="preserve">这一模块的任务是从深度图中提取对落脚有用的局部几何信息，并与本体历史融合。它的内部结构如图2所示，输入为深度图</w:t>
+        <w:t xml:space="preserve">这一部分的任务是从深度图中提取对落脚有用的局部几何信息，并与本体历史融合。视觉感知模块的内部结构如图2所示，它的输入为深度图</w:t>
       </w:r>
       <w:r>
         <w:t xml:space="preserve"> </w:t>
@@ -1250,7 +1538,10 @@
         </m:sSub>
       </m:oMath>
       <w:r>
-        <w:t xml:space="preserve">、本体历史</w:t>
+        <w:t xml:space="preserve"> </w:t>
+      </w:r>
+      <w:r>
+        <w:t xml:space="preserve">和视觉标志</w:t>
       </w:r>
       <w:r>
         <w:t xml:space="preserve"> </w:t>
@@ -1259,7 +1550,7 @@
         <m:sSub>
           <m:e>
             <m:r>
-              <m:t>O</m:t>
+              <m:t>b</m:t>
             </m:r>
           </m:e>
           <m:sub>
@@ -1270,30 +1561,7 @@
         </m:sSub>
       </m:oMath>
       <w:r>
-        <w:t xml:space="preserve"> </w:t>
-      </w:r>
-      <w:r>
-        <w:t xml:space="preserve">和视觉标志</w:t>
-      </w:r>
-      <w:r>
-        <w:t xml:space="preserve"> </w:t>
-      </w:r>
-      <m:oMath>
-        <m:sSub>
-          <m:e>
-            <m:r>
-              <m:t>b</m:t>
-            </m:r>
-          </m:e>
-          <m:sub>
-            <m:r>
-              <m:t>t</m:t>
-            </m:r>
-          </m:sub>
-        </m:sSub>
-      </m:oMath>
-      <w:r>
-        <w:t xml:space="preserve">，输出为融合本体特征</w:t>
+        <w:t xml:space="preserve">，输出为16个64维视觉token；之后的跨模态融合再把它们与本体token合并，输出融合本体特征</w:t>
       </w:r>
       <w:r>
         <w:t xml:space="preserve"> </w:t>
@@ -1356,7 +1624,7 @@
           <wp:inline>
             <wp:extent cx="5753100" cy="2319798"/>
             <wp:effectExtent b="0" l="0" r="0" t="0"/>
-            <wp:docPr descr="图2 视觉感知与跨模态融合模块结构" title="" id="25" name="Picture"/>
+            <wp:docPr descr="图2 视觉感知模块结构" title="" id="25" name="Picture"/>
             <a:graphic>
               <a:graphicData uri="http://schemas.openxmlformats.org/drawingml/2006/picture">
                 <pic:pic>
@@ -1399,7 +1667,7 @@
         <w:pStyle w:val="ImageCaption"/>
       </w:pPr>
       <w:r>
-        <w:t xml:space="preserve">图2 视觉感知与跨模态融合模块结构</w:t>
+        <w:t xml:space="preserve">图2 视觉感知模块结构</w:t>
       </w:r>
     </w:p>
     <w:p>
@@ -1417,7 +1685,7 @@
         <w:t xml:space="preserve"> </w:t>
       </w:r>
       <w:r>
-        <w:t xml:space="preserve">训练时的深度图由相机射线与地形网格求交得到，原始分辨率60×106，经过裁剪和双线性缩放变为58×87，有效距离截断在0～2 m后线性映射到[−0.5, 0.5]。编码器由三层卷积组成（卷积核3×3，步长2，填充1），特征图尺寸依次为16×29×44、32×15×22和64×8×11。最后的8×11个空间位置各自对应一个64维token，共88个，每个token描述深度图上一小块区域的几何形状。</w:t>
+        <w:t xml:space="preserve">训练时的深度图由相机射线与地形网格求交得到，原始分辨率60×106，经过裁剪和双线性缩放变为58×87，有效距离截断在0～2 m后线性映射到[−0.5, 0.5]。编码器（图2中的Enc）由三层卷积组成，卷积核3×3，步长2，填充1，每层后接ELU激活，通道数依次为16、32、64，特征图尺寸依次为29×44、15×22和8×11。最后的8×11个空间位置各自对应一个64维token，经层归一化后得到88个token，每个token描述深度图上一小块区域的几何形状。</w:t>
       </w:r>
     </w:p>
     <w:p>
@@ -1435,7 +1703,7 @@
         <w:t xml:space="preserve"> </w:t>
       </w:r>
       <w:r>
-        <w:t xml:space="preserve">为了让token确实保留局部几何，而不是只学到对奖励有用的捷径特征，训练时给每个token接一个局部解码器（64→128→225），要求它重建对应位置15×15的深度块。深度块由unfold操作从原图上以步长8滑窗得到，正好也是88块。重建损失为</w:t>
+        <w:t xml:space="preserve">为了让token确实保留局部几何，而不是只学到对奖励有用的捷径特征，训练时给每个token接一个局部解码器（图2中的Dec，结构为64→128→225，中间为ELU），要求它重建对应位置15×15的深度块。深度块由unfold操作在原图上以15×15窗口、步长8、填充7滑动得到，高度和宽度方向分别为8块和11块，正好与token一一对应。重建损失为</w:t>
       </w:r>
     </w:p>
     <w:p>
@@ -1464,11 +1732,19 @@
           </m:e>
           <m:sub>
             <m:r>
-              <m:rPr>
-                <m:nor/>
-                <m:sty m:val="p"/>
-              </m:rPr>
-              <m:t>patch</m:t>
+              <m:t>p</m:t>
+            </m:r>
+            <m:r>
+              <m:t>a</m:t>
+            </m:r>
+            <m:r>
+              <m:t>t</m:t>
+            </m:r>
+            <m:r>
+              <m:t>c</m:t>
+            </m:r>
+            <m:r>
+              <m:t>h</m:t>
             </m:r>
           </m:sub>
         </m:sSub>
@@ -1674,7 +1950,7 @@
         <w:t xml:space="preserve"> </w:t>
       </w:r>
       <w:r>
-        <w:t xml:space="preserve">是对应的真实深度块，</w:t>
+        <w:t xml:space="preserve">是对应的原始深度块，</w:t>
       </w:r>
       <m:oMath>
         <m:r>
@@ -1703,13 +1979,94 @@
           <w:bCs/>
           <w:b/>
         </w:rPr>
-        <w:t xml:space="preserve">主动采样。</w:t>
-      </w:r>
-      <w:r>
-        <w:t xml:space="preserve"> </w:t>
-      </w:r>
-      <w:r>
-        <w:t xml:space="preserve">88个token全部送入Transformer计算量偏大，而且远处和边缘区域对落脚帮助不大。模块先对有效token取平均，由坐标MLP一次预测16个二维采样坐标（经Sigmoid限制在图像范围内），再用双线性插值（grid_sample）从token图上取出这16个位置的特征。采样坐标经过一个2→64的编码后加到特征上，让后面的网络知道每个特征来自图像的哪个位置。采样点的位置随输入变化，网络可以根据当前地形把注意力放在前方台阶边缘或落脚区域上。</w:t>
+        <w:t xml:space="preserve">有效掩码。</w:t>
+      </w:r>
+      <w:r>
+        <w:t xml:space="preserve"> </w:t>
+      </w:r>
+      <w:r>
+        <w:t xml:space="preserve">token图在采样之前先乘以有效掩码</w:t>
+      </w:r>
+      <w:r>
+        <w:t xml:space="preserve"> </w:t>
+      </w:r>
+      <m:oMath>
+        <m:sSub>
+          <m:e>
+            <m:r>
+              <m:t>m</m:t>
+            </m:r>
+          </m:e>
+          <m:sub>
+            <m:r>
+              <m:t>t</m:t>
+            </m:r>
+          </m:sub>
+        </m:sSub>
+      </m:oMath>
+      <w:r>
+        <w:t xml:space="preserve">。视觉标志</w:t>
+      </w:r>
+      <w:r>
+        <w:t xml:space="preserve"> </w:t>
+      </w:r>
+      <m:oMath>
+        <m:sSub>
+          <m:e>
+            <m:r>
+              <m:t>b</m:t>
+            </m:r>
+          </m:e>
+          <m:sub>
+            <m:r>
+              <m:t>t</m:t>
+            </m:r>
+          </m:sub>
+        </m:sSub>
+        <m:r>
+          <m:rPr>
+            <m:sty m:val="p"/>
+          </m:rPr>
+          <m:t>=</m:t>
+        </m:r>
+        <m:r>
+          <m:t>0</m:t>
+        </m:r>
+      </m:oMath>
+      <w:r>
+        <w:t xml:space="preserve"> </w:t>
+      </w:r>
+      <w:r>
+        <w:t xml:space="preserve">时全部token被屏蔽；</w:t>
+      </w:r>
+      <m:oMath>
+        <m:sSub>
+          <m:e>
+            <m:r>
+              <m:t>b</m:t>
+            </m:r>
+          </m:e>
+          <m:sub>
+            <m:r>
+              <m:t>t</m:t>
+            </m:r>
+          </m:sub>
+        </m:sSub>
+        <m:r>
+          <m:rPr>
+            <m:sty m:val="p"/>
+          </m:rPr>
+          <m:t>=</m:t>
+        </m:r>
+        <m:r>
+          <m:t>1</m:t>
+        </m:r>
+      </m:oMath>
+      <w:r>
+        <w:t xml:space="preserve"> </w:t>
+      </w:r>
+      <w:r>
+        <w:t xml:space="preserve">时，训练阶段还会随机屏蔽1～3个空间上连续的小块（每块1×2到2×3个token，总比例0～0.15），模拟深度相机在反光、强光或遮挡下的局部缺失。遮挡块的中心按位置加权抽取，图像下部地面区域和上部远处区域被选中的概率更高。另外，简单地形上视觉标志会周期性关闭，部分全向运动环境始终关闭视觉，迫使策略学会仅靠本体感知行走。部署时不做随机遮挡。</w:t>
       </w:r>
     </w:p>
     <w:p>
@@ -1717,7 +2074,17 @@
         <w:pStyle w:val="BodyText"/>
       </w:pPr>
       <w:r>
-        <w:t xml:space="preserve">视觉失效时，有效掩码</w:t>
+        <w:rPr>
+          <w:bCs/>
+          <w:b/>
+        </w:rPr>
+        <w:t xml:space="preserve">主动采样。</w:t>
+      </w:r>
+      <w:r>
+        <w:t xml:space="preserve"> </w:t>
+      </w:r>
+      <w:r>
+        <w:t xml:space="preserve">88个token全部送入Transformer计算量偏大，而且远处和边缘区域对落脚帮助不大。模块先对有效token求平均得到一个64维的全局特征，再由坐标MLP（64→64→32，中间为ReLU，输出经Sigmoid限制在0～1）一次预测16个二维采样坐标</w:t>
       </w:r>
       <w:r>
         <w:t xml:space="preserve"> </w:t>
@@ -1726,7 +2093,7 @@
         <m:sSub>
           <m:e>
             <m:r>
-              <m:t>m</m:t>
+              <m:t>P</m:t>
             </m:r>
           </m:e>
           <m:sub>
@@ -1735,12 +2102,90 @@
             </m:r>
           </m:sub>
         </m:sSub>
+        <m:r>
+          <m:rPr>
+            <m:sty m:val="p"/>
+          </m:rPr>
+          <m:t>=</m:t>
+        </m:r>
+        <m:r>
+          <m:rPr>
+            <m:sty m:val="p"/>
+          </m:rPr>
+          <m:t>{</m:t>
+        </m:r>
+        <m:d>
+          <m:dPr>
+            <m:begChr m:val="("/>
+            <m:endChr m:val=")"/>
+            <m:sepChr m:val=""/>
+            <m:grow/>
+          </m:dPr>
+          <m:e>
+            <m:sSub>
+              <m:e>
+                <m:r>
+                  <m:t>u</m:t>
+                </m:r>
+              </m:e>
+              <m:sub>
+                <m:r>
+                  <m:t>k</m:t>
+                </m:r>
+              </m:sub>
+            </m:sSub>
+            <m:r>
+              <m:rPr>
+                <m:sty m:val="p"/>
+              </m:rPr>
+              <m:t>,</m:t>
+            </m:r>
+            <m:sSub>
+              <m:e>
+                <m:r>
+                  <m:t>v</m:t>
+                </m:r>
+              </m:e>
+              <m:sub>
+                <m:r>
+                  <m:t>k</m:t>
+                </m:r>
+              </m:sub>
+            </m:sSub>
+          </m:e>
+        </m:d>
+        <m:sSubSup>
+          <m:e>
+            <m:r>
+              <m:rPr>
+                <m:sty m:val="p"/>
+              </m:rPr>
+              <m:t>}</m:t>
+            </m:r>
+          </m:e>
+          <m:sub>
+            <m:r>
+              <m:t>k</m:t>
+            </m:r>
+            <m:r>
+              <m:rPr>
+                <m:sty m:val="p"/>
+              </m:rPr>
+              <m:t>=</m:t>
+            </m:r>
+            <m:r>
+              <m:t>1</m:t>
+            </m:r>
+          </m:sub>
+          <m:sup>
+            <m:r>
+              <m:t>16</m:t>
+            </m:r>
+          </m:sup>
+        </m:sSubSup>
       </m:oMath>
       <w:r>
-        <w:t xml:space="preserve"> </w:t>
-      </w:r>
-      <w:r>
-        <w:t xml:space="preserve">会把对应位置屏蔽，采样到的有效权重过低的点在Transformer中按padding处理。训练时还会随机遮挡token图上1～3个空间连续的小块（比例0～0.15），模拟深度相机在反光、强光或遮挡下的局部缺失；简单地形上视觉标志也会周期性关闭，强迫策略学会仅靠本体感知行走。</w:t>
+        <w:t xml:space="preserve">，训练时坐标上加标准差0.02的小扰动。随后用双线性插值（grid_sample）从掩码后的token图上取出这16个位置的特征，再加上坐标编码（2→64→64，中间为ReLU），让后面的网络知道每个特征来自图像的哪个位置。采样点的位置随输入变化，网络可以根据当前地形把注意力放在前方台阶边缘或落脚区域上。如果某个采样点周围几乎都是被屏蔽的token（插值后的有效权重不超过0.05），该点在Transformer中按padding处理。</w:t>
       </w:r>
     </w:p>
     <w:p>
@@ -1758,7 +2203,7 @@
         <w:t xml:space="preserve"> </w:t>
       </w:r>
       <w:r>
-        <w:t xml:space="preserve">本体历史中的每一帧经过本体MLP（45→64）得到一个token，视觉标志</w:t>
+        <w:t xml:space="preserve">本体历史中的每一帧经过本体MLP（45→256→128→64，ELU激活）和层归一化得到一个本体token，共10个。视觉标志token直接由</w:t>
       </w:r>
       <w:r>
         <w:t xml:space="preserve"> </w:t>
@@ -1781,7 +2226,7 @@
         <w:t xml:space="preserve"> </w:t>
       </w:r>
       <w:r>
-        <w:t xml:space="preserve">嵌入为一个token，加上16个视觉token，共27个64维token。每个token再加上位置、时间和模态编码后送入一层Transformer编码器[5]（4头注意力，每头16维，前馈层64→256→64），核心运算是缩放点积注意力：</w:t>
+        <w:t xml:space="preserve">的数值加上固定的类型编码和位置编码构成，不含可学习参数。16个视觉token、10个本体token和1个标志token共27个64维token，每类token加上各自的模态类型编码，本体token另加时间位置编码，这些编码均为固定的正弦余弦编码。拼接后的序列送入一层标准Transformer编码器（4头注意力，每头16维，前馈层64→256→64，带残差连接和层归一化），核心运算是缩放点积注意力：</w:t>
       </w:r>
     </w:p>
     <w:p>
@@ -1925,7 +2370,7 @@
         <w:pStyle w:val="FirstParagraph"/>
       </w:pPr>
       <w:r>
-        <w:t xml:space="preserve">经过自注意力，本体token可以按需要从视觉token中读取地形信息。下游只取输出中对应10个本体位置的token作为</w:t>
+        <w:t xml:space="preserve">经过自注意力，本体token可以按需要从视觉token中读取地形信息；视觉token被屏蔽时，本体token只能在彼此之间交换信息，相当于自动退化为盲走模式。下游只取输出中对应10个本体位置的token作为</w:t>
       </w:r>
       <w:r>
         <w:t xml:space="preserve"> </w:t>
@@ -1980,7 +2425,7 @@
         <w:t xml:space="preserve"> </w:t>
       </w:r>
       <w:r>
-        <w:t xml:space="preserve">只包含最近约0.2 s的信息，而机器人通过一段地形往往需要几秒钟，相机也看不到已经走到机身下方的区域。读写记忆估计器的作用就是在较长时间尺度上积累地形信息，并把各种估计量整理成策略能直接使用的控制码。模块结构如图3所示，输入为</w:t>
+        <w:t xml:space="preserve">只包含最近约0.2 s的信息，而机器人通过一段地形往往需要几秒钟，相机也看不到已经走到机身下方的区域。读写记忆估计器的作用就是在较长时间尺度上积累地形信息，并把各种估计量整理成策略能直接使用的控制码。模块结构如图3所示，图中各方框内标出了对应子网络的层宽，输入为</w:t>
       </w:r>
       <w:r>
         <w:t xml:space="preserve"> </w:t>
@@ -2182,7 +2627,7 @@
         <w:pStyle w:val="BodyText"/>
       </w:pPr>
       <w:r>
-        <w:t xml:space="preserve">模块内部有两条相对独立的支路。上方的运动分支用一个GRU依次读入10个融合本体特征，取最后的隐藏状态</w:t>
+        <w:t xml:space="preserve">模块内部有两条相对独立的支路。上方的运动分支用一个单层GRU（隐状态64维）依次读入10个融合本体特征，取最后的隐藏状态</w:t>
       </w:r>
       <w:r>
         <w:t xml:space="preserve"> </w:t>
@@ -2207,7 +2652,7 @@
         </m:sSubSup>
       </m:oMath>
       <w:r>
-        <w:t xml:space="preserve">，经运动预测头输出机身线速度估计</w:t>
+        <w:t xml:space="preserve">。运动预测头先用一层线性层加ELU（64→64）做变换，再分别接两个线性输出层，得到机身线速度估计</w:t>
       </w:r>
       <w:r>
         <w:t xml:space="preserve"> </w:t>
@@ -2266,7 +2711,7 @@
         </m:sSubSup>
       </m:oMath>
       <w:r>
-        <w:t xml:space="preserve">（4维）。这条支路每次只看当前的10步窗口，不跨估计周期保存状态。下方的记忆支路负责地形相关的长时信息，是本模块的核心。</w:t>
+        <w:t xml:space="preserve">（4维）。运动GRU每次估计时都从零状态开始读入当前的10步窗口，不跨估计周期保存状态。下方的记忆支路负责地形相关的长时信息，是本模块的核心。</w:t>
       </w:r>
     </w:p>
     <w:p>
@@ -2352,44 +2797,64 @@
             <m:grow/>
           </m:dPr>
           <m:e>
-            <m:sSubSup>
-              <m:e>
-                <m:r>
-                  <m:rPr>
-                    <m:sty m:val="b"/>
-                  </m:rPr>
-                  <m:t>q</m:t>
-                </m:r>
-              </m:e>
-              <m:sub>
-                <m:r>
-                  <m:t>k</m:t>
-                </m:r>
-              </m:sub>
-              <m:sup>
-                <m:r>
-                  <m:rPr>
-                    <m:sty m:val="p"/>
-                  </m:rPr>
-                  <m:t>⊤</m:t>
-                </m:r>
-              </m:sup>
-            </m:sSubSup>
-            <m:sSub>
-              <m:e>
-                <m:r>
-                  <m:rPr>
-                    <m:sty m:val="b"/>
-                  </m:rPr>
-                  <m:t>x</m:t>
-                </m:r>
-              </m:e>
-              <m:sub>
-                <m:r>
-                  <m:t>j</m:t>
-                </m:r>
-              </m:sub>
-            </m:sSub>
+            <m:f>
+              <m:fPr>
+                <m:type m:val="bar"/>
+              </m:fPr>
+              <m:num>
+                <m:sSubSup>
+                  <m:e>
+                    <m:r>
+                      <m:rPr>
+                        <m:sty m:val="b"/>
+                      </m:rPr>
+                      <m:t>q</m:t>
+                    </m:r>
+                  </m:e>
+                  <m:sub>
+                    <m:r>
+                      <m:t>k</m:t>
+                    </m:r>
+                  </m:sub>
+                  <m:sup>
+                    <m:r>
+                      <m:rPr>
+                        <m:sty m:val="p"/>
+                      </m:rPr>
+                      <m:t>⊤</m:t>
+                    </m:r>
+                  </m:sup>
+                </m:sSubSup>
+                <m:sSub>
+                  <m:e>
+                    <m:r>
+                      <m:rPr>
+                        <m:sty m:val="b"/>
+                      </m:rPr>
+                      <m:t>x</m:t>
+                    </m:r>
+                  </m:e>
+                  <m:sub>
+                    <m:r>
+                      <m:t>j</m:t>
+                    </m:r>
+                  </m:sub>
+                </m:sSub>
+              </m:num>
+              <m:den>
+                <m:rad>
+                  <m:radPr>
+                    <m:degHide m:val="on"/>
+                  </m:radPr>
+                  <m:deg/>
+                  <m:e>
+                    <m:r>
+                      <m:t>d</m:t>
+                    </m:r>
+                  </m:e>
+                </m:rad>
+              </m:den>
+            </m:f>
           </m:e>
         </m:d>
         <m:r>
@@ -2566,7 +3031,24 @@
         <w:t xml:space="preserve"> </w:t>
       </w:r>
       <w:r>
-        <w:t xml:space="preserve">个token。共享查询</w:t>
+        <w:t xml:space="preserve">个token，</w:t>
+      </w:r>
+      <m:oMath>
+        <m:r>
+          <m:t>d</m:t>
+        </m:r>
+        <m:r>
+          <m:rPr>
+            <m:sty m:val="p"/>
+          </m:rPr>
+          <m:t>=</m:t>
+        </m:r>
+        <m:r>
+          <m:t>64</m:t>
+        </m:r>
+      </m:oMath>
+      <w:r>
+        <w:t xml:space="preserve">。共享查询</w:t>
       </w:r>
       <w:r>
         <w:t xml:space="preserve"> </w:t>
@@ -2618,7 +3100,7 @@
         <w:t xml:space="preserve"> </w:t>
       </w:r>
       <w:r>
-        <w:t xml:space="preserve">送入三个头：地形分类头输出13类地形概率</w:t>
+        <w:t xml:space="preserve">送入三个头：地形分类头（64→64→13）输出13类地形概率</w:t>
       </w:r>
       <w:r>
         <w:t xml:space="preserve"> </w:t>
@@ -2638,7 +3120,7 @@
         </m:sSub>
       </m:oMath>
       <w:r>
-        <w:t xml:space="preserve">，恢复判别头输出机器人是否处于跌倒恢复状态的概率</w:t>
+        <w:t xml:space="preserve">，恢复判别头（64→64→1，Sigmoid）输出机器人是否处于跌倒恢复状态的概率</w:t>
       </w:r>
       <w:r>
         <w:t xml:space="preserve"> </w:t>
@@ -2658,7 +3140,41 @@
         </m:sSub>
       </m:oMath>
       <w:r>
-        <w:t xml:space="preserve">，上下文头输出64维上下文特征。随后</w:t>
+        <w:t xml:space="preserve">，上下文头（64→64，ELU）输出64维上下文特征</w:t>
+      </w:r>
+      <w:r>
+        <w:t xml:space="preserve"> </w:t>
+      </w:r>
+      <m:oMath>
+        <m:sSubSup>
+          <m:e>
+            <m:r>
+              <m:rPr>
+                <m:sty m:val="b"/>
+              </m:rPr>
+              <m:t>f</m:t>
+            </m:r>
+          </m:e>
+          <m:sub>
+            <m:r>
+              <m:t>t</m:t>
+            </m:r>
+          </m:sub>
+          <m:sup>
+            <m:r>
+              <m:t>c</m:t>
+            </m:r>
+            <m:r>
+              <m:t>t</m:t>
+            </m:r>
+            <m:r>
+              <m:t>x</m:t>
+            </m:r>
+          </m:sup>
+        </m:sSubSup>
+      </m:oMath>
+      <w:r>
+        <w:t xml:space="preserve">。随后</w:t>
       </w:r>
       <w:r>
         <w:t xml:space="preserve"> </w:t>
@@ -2704,7 +3220,7 @@
         <w:t xml:space="preserve"> </w:t>
       </w:r>
       <w:r>
-        <w:t xml:space="preserve">各自经过两组编码器，一组（64维）加到专家特征上，另一组（32维和16维）与当前观测、视觉标志和上下文特征拼接成158维向量，送入路由MLP得到3个记忆专家的权重：</w:t>
+        <w:t xml:space="preserve">各自经过两组两层编码器：一组输出64维，加到专家特征上；另一组输出32维和16维，与当前观测、视觉标志和上下文特征拼接成158维向量，送入路由MLP（158→128→3，中间为ReLU）得到3个记忆专家的权重：</w:t>
       </w:r>
     </w:p>
     <w:p>
@@ -2843,11 +3359,13 @@
                       </m:sub>
                       <m:sup>
                         <m:r>
-                          <m:rPr>
-                            <m:nor/>
-                            <m:sty m:val="p"/>
-                          </m:rPr>
-                          <m:t>ctx</m:t>
+                          <m:t>c</m:t>
+                        </m:r>
+                        <m:r>
+                          <m:t>t</m:t>
+                        </m:r>
+                        <m:r>
+                          <m:t>x</m:t>
                         </m:r>
                       </m:sup>
                     </m:sSubSup>
@@ -3014,7 +3532,33 @@
         </m:sSub>
       </m:oMath>
       <w:r>
-        <w:t xml:space="preserve">，池化后加上地形和恢复编码，得到专家输入</w:t>
+        <w:t xml:space="preserve">，池化结果</w:t>
+      </w:r>
+      <w:r>
+        <w:t xml:space="preserve"> </w:t>
+      </w:r>
+      <m:oMath>
+        <m:sSub>
+          <m:e>
+            <m:r>
+              <m:rPr>
+                <m:sty m:val="b"/>
+              </m:rPr>
+              <m:t>p</m:t>
+            </m:r>
+          </m:e>
+          <m:sub>
+            <m:r>
+              <m:t>i</m:t>
+            </m:r>
+          </m:sub>
+        </m:sSub>
+      </m:oMath>
+      <w:r>
+        <w:t xml:space="preserve"> </w:t>
+      </w:r>
+      <w:r>
+        <w:t xml:space="preserve">加上地形和恢复的64维编码，得到专家输入</w:t>
       </w:r>
       <w:r>
         <w:t xml:space="preserve"> </w:t>
@@ -3046,7 +3590,7 @@
         </m:sSub>
       </m:oMath>
       <w:r>
-        <w:t xml:space="preserve">。专家内部依次执行”读—更新—写”三步：读MLP把共享状态映射为GRUCell的初始隐藏状态，GRUCell[6]用</w:t>
+        <w:t xml:space="preserve">。专家内部依次执行”读—更新—写”三步：读MLP（64→64→64）把共享状态映射为GRUCell的初始隐藏状态，GRUCell（输入64、隐状态64）用</w:t>
       </w:r>
       <w:r>
         <w:t xml:space="preserve"> </w:t>
@@ -3081,7 +3625,7 @@
         <w:t xml:space="preserve"> </w:t>
       </w:r>
       <w:r>
-        <w:t xml:space="preserve">更新它，写MLP再根据更新后的隐藏状态给出对共享状态的修改量：</w:t>
+        <w:t xml:space="preserve">更新它，写MLP（64→64→64）再根据更新后的隐藏状态给出对共享状态的修改量：</w:t>
       </w:r>
     </w:p>
     <w:p>
@@ -3864,7 +4408,53 @@
         <w:pStyle w:val="FirstParagraph"/>
       </w:pPr>
       <w:r>
-        <w:t xml:space="preserve">写入门</w:t>
+        <w:t xml:space="preserve">其中候选网络</w:t>
+      </w:r>
+      <w:r>
+        <w:t xml:space="preserve"> </w:t>
+      </w:r>
+      <m:oMath>
+        <m:sSub>
+          <m:e>
+            <m:r>
+              <m:t>F</m:t>
+            </m:r>
+          </m:e>
+          <m:sub>
+            <m:r>
+              <m:t>c</m:t>
+            </m:r>
+          </m:sub>
+        </m:sSub>
+      </m:oMath>
+      <w:r>
+        <w:t xml:space="preserve"> </w:t>
+      </w:r>
+      <w:r>
+        <w:t xml:space="preserve">为128→64→64，写入门</w:t>
+      </w:r>
+      <w:r>
+        <w:t xml:space="preserve"> </w:t>
+      </w:r>
+      <m:oMath>
+        <m:sSub>
+          <m:e>
+            <m:r>
+              <m:t>F</m:t>
+            </m:r>
+          </m:e>
+          <m:sub>
+            <m:r>
+              <m:t>u</m:t>
+            </m:r>
+          </m:sub>
+        </m:sSub>
+      </m:oMath>
+      <w:r>
+        <w:t xml:space="preserve"> </w:t>
+      </w:r>
+      <w:r>
+        <w:t xml:space="preserve">为128→64加Sigmoid。写入门</w:t>
       </w:r>
       <w:r>
         <w:t xml:space="preserve"> </w:t>
@@ -4004,7 +4594,7 @@
         <w:t xml:space="preserve"> </w:t>
       </w:r>
       <w:r>
-        <w:t xml:space="preserve">拼接后送入地形预测头，得到16维地形潜变量均值</w:t>
+        <w:t xml:space="preserve">拼接后送入地形预测头（128→64，ELU），再由两个线性输出层得到16维地形潜变量均值</w:t>
       </w:r>
       <w:r>
         <w:t xml:space="preserve"> </w:t>
@@ -4051,11 +4641,10 @@
           </m:sub>
           <m:sup>
             <m:r>
-              <m:rPr>
-                <m:nor/>
-                <m:sty m:val="p"/>
-              </m:rPr>
-              <m:t>tm</m:t>
+              <m:t>t</m:t>
+            </m:r>
+            <m:r>
+              <m:t>m</m:t>
             </m:r>
           </m:sup>
         </m:sSubSup>
@@ -4211,11 +4800,10 @@
               </m:sub>
               <m:sup>
                 <m:r>
-                  <m:rPr>
-                    <m:nor/>
-                    <m:sty m:val="p"/>
-                  </m:rPr>
-                  <m:t>tm</m:t>
+                  <m:t>t</m:t>
+                </m:r>
+                <m:r>
+                  <m:t>m</m:t>
                 </m:r>
               </m:sup>
             </m:sSubSup>
@@ -4228,47 +4816,25 @@
             <m:r>
               <m:t> </m:t>
             </m:r>
-            <m:r>
-              <m:rPr>
-                <m:nor/>
-                <m:sty m:val="p"/>
-              </m:rPr>
-              <m:t>onehot</m:t>
-            </m:r>
-            <m:d>
-              <m:dPr>
-                <m:begChr m:val="("/>
-                <m:endChr m:val=")"/>
-                <m:sepChr m:val=""/>
-                <m:grow/>
-              </m:dPr>
+            <m:sSub>
               <m:e>
-                <m:r>
-                  <m:rPr>
-                    <m:sty m:val="p"/>
-                  </m:rPr>
-                  <m:t>arg</m:t>
-                </m:r>
-                <m:r>
-                  <m:rPr>
-                    <m:sty m:val="p"/>
-                  </m:rPr>
-                  <m:t>max</m:t>
-                </m:r>
-                <m:sSub>
+                <m:acc>
+                  <m:accPr>
+                    <m:chr m:val="̂"/>
+                  </m:accPr>
                   <m:e>
                     <m:r>
                       <m:t>c</m:t>
                     </m:r>
                   </m:e>
-                  <m:sub>
-                    <m:r>
-                      <m:t>t</m:t>
-                    </m:r>
-                  </m:sub>
-                </m:sSub>
+                </m:acc>
               </m:e>
-            </m:d>
+              <m:sub>
+                <m:r>
+                  <m:t>t</m:t>
+                </m:r>
+              </m:sub>
+            </m:sSub>
             <m:r>
               <m:rPr>
                 <m:sty m:val="p"/>
@@ -4278,44 +4844,25 @@
             <m:r>
               <m:t> </m:t>
             </m:r>
-            <m:r>
-              <m:rPr>
-                <m:sty m:val="p"/>
-                <m:scr m:val="double-struck"/>
-              </m:rPr>
-              <m:t>1</m:t>
-            </m:r>
-            <m:d>
-              <m:dPr>
-                <m:begChr m:val="["/>
-                <m:endChr m:val="]"/>
-                <m:sepChr m:val=""/>
-                <m:grow/>
-              </m:dPr>
+            <m:sSub>
               <m:e>
-                <m:sSub>
+                <m:acc>
+                  <m:accPr>
+                    <m:chr m:val="̂"/>
+                  </m:accPr>
                   <m:e>
                     <m:r>
                       <m:t>r</m:t>
                     </m:r>
                   </m:e>
-                  <m:sub>
-                    <m:r>
-                      <m:t>t</m:t>
-                    </m:r>
-                  </m:sub>
-                </m:sSub>
-                <m:r>
-                  <m:rPr>
-                    <m:sty m:val="p"/>
-                  </m:rPr>
-                  <m:t>≥</m:t>
-                </m:r>
-                <m:r>
-                  <m:t>0.5</m:t>
-                </m:r>
+                </m:acc>
               </m:e>
-            </m:d>
+              <m:sub>
+                <m:r>
+                  <m:t>t</m:t>
+                </m:r>
+              </m:sub>
+            </m:sSub>
             <m:r>
               <m:t> </m:t>
             </m:r>
@@ -4356,7 +4903,149 @@
         <w:pStyle w:val="FirstParagraph"/>
       </w:pPr>
       <w:r>
-        <w:t xml:space="preserve">其中地形类别和恢复状态以离散形式进入控制码，连续的概率值只在估计器内部用于路由。控制码在送入策略网络之前截断梯度，也就是说PPO的梯度不会回传到估计器，估计器完全由下面的监督目标训练。</w:t>
+        <w:t xml:space="preserve">其中</w:t>
+      </w:r>
+      <w:r>
+        <w:t xml:space="preserve"> </w:t>
+      </w:r>
+      <m:oMath>
+        <m:sSub>
+          <m:e>
+            <m:acc>
+              <m:accPr>
+                <m:chr m:val="̂"/>
+              </m:accPr>
+              <m:e>
+                <m:r>
+                  <m:t>c</m:t>
+                </m:r>
+              </m:e>
+            </m:acc>
+          </m:e>
+          <m:sub>
+            <m:r>
+              <m:t>t</m:t>
+            </m:r>
+          </m:sub>
+        </m:sSub>
+        <m:r>
+          <m:rPr>
+            <m:sty m:val="p"/>
+          </m:rPr>
+          <m:t>=</m:t>
+        </m:r>
+        <m:r>
+          <m:rPr>
+            <m:nor/>
+            <m:sty m:val="p"/>
+          </m:rPr>
+          <m:t>onehot</m:t>
+        </m:r>
+        <m:d>
+          <m:dPr>
+            <m:begChr m:val="("/>
+            <m:endChr m:val=")"/>
+            <m:sepChr m:val=""/>
+            <m:grow/>
+          </m:dPr>
+          <m:e>
+            <m:r>
+              <m:rPr>
+                <m:sty m:val="p"/>
+              </m:rPr>
+              <m:t>arg</m:t>
+            </m:r>
+            <m:r>
+              <m:rPr>
+                <m:sty m:val="p"/>
+              </m:rPr>
+              <m:t>max</m:t>
+            </m:r>
+            <m:sSub>
+              <m:e>
+                <m:r>
+                  <m:t>c</m:t>
+                </m:r>
+              </m:e>
+              <m:sub>
+                <m:r>
+                  <m:t>t</m:t>
+                </m:r>
+              </m:sub>
+            </m:sSub>
+          </m:e>
+        </m:d>
+      </m:oMath>
+      <w:r>
+        <w:t xml:space="preserve">，</w:t>
+      </w:r>
+      <m:oMath>
+        <m:sSub>
+          <m:e>
+            <m:acc>
+              <m:accPr>
+                <m:chr m:val="̂"/>
+              </m:accPr>
+              <m:e>
+                <m:r>
+                  <m:t>r</m:t>
+                </m:r>
+              </m:e>
+            </m:acc>
+          </m:e>
+          <m:sub>
+            <m:r>
+              <m:t>t</m:t>
+            </m:r>
+          </m:sub>
+        </m:sSub>
+        <m:r>
+          <m:rPr>
+            <m:sty m:val="p"/>
+          </m:rPr>
+          <m:t>=</m:t>
+        </m:r>
+        <m:r>
+          <m:rPr>
+            <m:sty m:val="p"/>
+            <m:scr m:val="double-struck"/>
+          </m:rPr>
+          <m:t>1</m:t>
+        </m:r>
+        <m:d>
+          <m:dPr>
+            <m:begChr m:val="["/>
+            <m:endChr m:val="]"/>
+            <m:sepChr m:val=""/>
+            <m:grow/>
+          </m:dPr>
+          <m:e>
+            <m:sSub>
+              <m:e>
+                <m:r>
+                  <m:t>r</m:t>
+                </m:r>
+              </m:e>
+              <m:sub>
+                <m:r>
+                  <m:t>t</m:t>
+                </m:r>
+              </m:sub>
+            </m:sSub>
+            <m:r>
+              <m:rPr>
+                <m:sty m:val="p"/>
+              </m:rPr>
+              <m:t>≥</m:t>
+            </m:r>
+            <m:r>
+              <m:t>0.5</m:t>
+            </m:r>
+          </m:e>
+        </m:d>
+      </m:oMath>
+      <w:r>
+        <w:t xml:space="preserve">，即地形类别和恢复状态以离散形式进入控制码，连续的概率值只在估计器内部用于路由。控制码在送入策略网络之前截断梯度，也就是说PPO的梯度不会回传到估计器，估计器完全由下面的监督目标训练。</w:t>
       </w:r>
     </w:p>
     <w:bookmarkEnd w:id="31"/>
@@ -4374,7 +5063,675 @@
         <w:pStyle w:val="FirstParagraph"/>
       </w:pPr>
       <w:r>
-        <w:t xml:space="preserve">如果只用策略梯度训练估计器，中间变量的含义很难保证，训练也不稳定。因此估计器配有一组辅助解码头和监督目标，全部真值都来自仿真器，部署时这些解码头可以去掉。总损失为</w:t>
+        <w:t xml:space="preserve">如果只用策略梯度训练估计器，中间变量的含义很难保证，训练也不稳定。因此估计器配有一组辅助解码头和监督目标，全部真值都来自仿真器，部署时这些解码头可以去掉。图3中没有画出的训练专用子网络列于表2，层与层之间均为ELU激活。</w:t>
+      </w:r>
+    </w:p>
+    <w:p>
+      <w:pPr>
+        <w:pStyle w:val="TableCaption"/>
+        <w:keepNext/>
+      </w:pPr>
+      <w:r>
+        <w:t xml:space="preserve">表2 估计器中仅训练使用的子网络</w:t>
+      </w:r>
+    </w:p>
+    <w:tbl>
+      <w:tblPr>
+        <w:tblW w:type="pct" w:w="5000"/>
+        <w:tblLook w:firstRow="1" w:lastRow="0" w:firstColumn="0" w:lastColumn="0" w:noHBand="0" w:noVBand="0" w:val="0020"/>
+        <w:jc w:val="start"/>
+        <w:tblCaption w:val="表2 估计器中仅训练使用的子网络"/>
+        <w:tblBorders>
+          <w:top w:val="single" w:sz="12" w:space="0" w:color="000000"/>
+          <w:left w:val="nil"/>
+          <w:bottom w:val="single" w:sz="12" w:space="0" w:color="000000"/>
+          <w:right w:val="nil"/>
+          <w:insideH w:val="nil"/>
+          <w:insideV w:val="nil"/>
+        </w:tblBorders>
+        <w:jc w:val="center"/>
+      </w:tblPr>
+      <w:tblGrid>
+        <w:gridCol w:w="1980"/>
+        <w:gridCol w:w="1980"/>
+        <w:gridCol w:w="1980"/>
+        <w:gridCol w:w="1980"/>
+      </w:tblGrid>
+      <w:tr>
+        <w:trPr>
+          <w:tblHeader w:val="true"/>
+        </w:trPr>
+        <w:tc>
+          <w:tcPr>
+            <w:tcBorders>
+              <w:bottom w:val="single" w:sz="6" w:space="0" w:color="000000"/>
+            </w:tcBorders>
+          </w:tcPr>
+          <w:p>
+            <w:pPr>
+              <w:pStyle w:val="Compact"/>
+              <w:keepNext/>
+              <w:ind w:firstLine="0"/>
+              <w:jc w:val="left"/>
+            </w:pPr>
+            <w:r>
+              <w:rPr>
+                <w:b/>
+                <w:sz w:val="21"/>
+              </w:rPr>
+              <w:t xml:space="preserve">子网络</w:t>
+            </w:r>
+          </w:p>
+        </w:tc>
+        <w:tc>
+          <w:tcPr>
+            <w:tcBorders>
+              <w:bottom w:val="single" w:sz="6" w:space="0" w:color="000000"/>
+            </w:tcBorders>
+          </w:tcPr>
+          <w:p>
+            <w:pPr>
+              <w:pStyle w:val="Compact"/>
+              <w:keepNext/>
+              <w:ind w:firstLine="0"/>
+              <w:jc w:val="left"/>
+            </w:pPr>
+            <w:r>
+              <w:rPr>
+                <w:b/>
+                <w:sz w:val="21"/>
+              </w:rPr>
+              <w:t xml:space="preserve">输入</w:t>
+            </w:r>
+          </w:p>
+        </w:tc>
+        <w:tc>
+          <w:tcPr>
+            <w:tcBorders>
+              <w:bottom w:val="single" w:sz="6" w:space="0" w:color="000000"/>
+            </w:tcBorders>
+          </w:tcPr>
+          <w:p>
+            <w:pPr>
+              <w:pStyle w:val="Compact"/>
+              <w:keepNext/>
+              <w:ind w:firstLine="0"/>
+              <w:jc w:val="left"/>
+            </w:pPr>
+            <w:r>
+              <w:rPr>
+                <w:b/>
+                <w:sz w:val="21"/>
+              </w:rPr>
+              <w:t xml:space="preserve">结构</w:t>
+            </w:r>
+          </w:p>
+        </w:tc>
+        <w:tc>
+          <w:tcPr>
+            <w:tcBorders>
+              <w:bottom w:val="single" w:sz="6" w:space="0" w:color="000000"/>
+            </w:tcBorders>
+          </w:tcPr>
+          <w:p>
+            <w:pPr>
+              <w:pStyle w:val="Compact"/>
+              <w:keepNext/>
+              <w:ind w:firstLine="0"/>
+              <w:jc w:val="left"/>
+            </w:pPr>
+            <w:r>
+              <w:rPr>
+                <w:b/>
+                <w:sz w:val="21"/>
+              </w:rPr>
+              <w:t xml:space="preserve">作用</w:t>
+            </w:r>
+          </w:p>
+        </w:tc>
+      </w:tr>
+      <w:tr>
+        <w:tc>
+          <w:tcPr/>
+          <w:p>
+            <w:pPr>
+              <w:pStyle w:val="Compact"/>
+              <w:keepNext/>
+              <w:ind w:firstLine="0"/>
+              <w:jc w:val="left"/>
+            </w:pPr>
+            <w:r>
+              <w:rPr>
+                <w:sz w:val="21"/>
+              </w:rPr>
+              <w:t xml:space="preserve">运动潜变量头</w:t>
+            </w:r>
+          </w:p>
+        </w:tc>
+        <w:tc>
+          <w:tcPr/>
+          <w:p>
+            <w:pPr>
+              <w:pStyle w:val="Compact"/>
+              <w:keepNext/>
+              <w:ind w:firstLine="0"/>
+              <w:jc w:val="left"/>
+            </w:pPr>
+            <w:r>
+              <w:rPr>
+                <w:sz w:val="21"/>
+              </w:rPr>
+              <w:t xml:space="preserve">运动预测头输出64</w:t>
+            </w:r>
+          </w:p>
+        </w:tc>
+        <w:tc>
+          <w:tcPr/>
+          <w:p>
+            <w:pPr>
+              <w:pStyle w:val="Compact"/>
+              <w:keepNext/>
+              <w:ind w:firstLine="0"/>
+              <w:jc w:val="left"/>
+            </w:pPr>
+            <w:r>
+              <w:rPr>
+                <w:sz w:val="21"/>
+              </w:rPr>
+              <w:t xml:space="preserve">两个线性层，各64→16</w:t>
+            </w:r>
+          </w:p>
+        </w:tc>
+        <w:tc>
+          <w:tcPr/>
+          <w:p>
+            <w:pPr>
+              <w:pStyle w:val="Compact"/>
+              <w:keepNext/>
+              <w:ind w:firstLine="0"/>
+              <w:jc w:val="left"/>
+            </w:pPr>
+            <w:r>
+              <w:rPr>
+                <w:sz w:val="21"/>
+              </w:rPr>
+              <w:t xml:space="preserve">运动潜变量的均值和对数方差</w:t>
+            </w:r>
+          </w:p>
+        </w:tc>
+      </w:tr>
+      <w:tr>
+        <w:tc>
+          <w:tcPr/>
+          <w:p>
+            <w:pPr>
+              <w:pStyle w:val="Compact"/>
+              <w:keepNext/>
+              <w:ind w:firstLine="0"/>
+              <w:jc w:val="left"/>
+            </w:pPr>
+            <w:r>
+              <w:rPr>
+                <w:sz w:val="21"/>
+              </w:rPr>
+              <w:t xml:space="preserve">运动观测解码器</w:t>
+            </w:r>
+          </w:p>
+        </w:tc>
+        <w:tc>
+          <w:tcPr/>
+          <w:p>
+            <w:pPr>
+              <w:pStyle w:val="Compact"/>
+              <w:keepNext/>
+              <w:ind w:firstLine="0"/>
+              <w:jc w:val="left"/>
+            </w:pPr>
+            <m:oMath>
+              <m:d>
+                <m:dPr>
+                  <m:begChr m:val="["/>
+                  <m:endChr m:val="]"/>
+                  <m:sepChr m:val=""/>
+                  <m:grow/>
+                </m:dPr>
+                <m:e>
+                  <m:sSub>
+                    <m:e>
+                      <m:acc>
+                        <m:accPr>
+                          <m:chr m:val="̂"/>
+                        </m:accPr>
+                        <m:e>
+                          <m:r>
+                            <m:t>v</m:t>
+                          </m:r>
+                        </m:e>
+                      </m:acc>
+                    </m:e>
+                    <m:sub>
+                      <m:r>
+                        <m:t>t</m:t>
+                      </m:r>
+                    </m:sub>
+                  </m:sSub>
+                  <m:r>
+                    <m:rPr>
+                      <m:sty m:val="p"/>
+                    </m:rPr>
+                    <m:t>,</m:t>
+                  </m:r>
+                  <m:sSubSup>
+                    <m:e>
+                      <m:acc>
+                        <m:accPr>
+                          <m:chr m:val="̂"/>
+                        </m:accPr>
+                        <m:e>
+                          <m:r>
+                            <m:t>h</m:t>
+                          </m:r>
+                        </m:e>
+                      </m:acc>
+                    </m:e>
+                    <m:sub>
+                      <m:r>
+                        <m:t>t</m:t>
+                      </m:r>
+                    </m:sub>
+                    <m:sup>
+                      <m:r>
+                        <m:t>f</m:t>
+                      </m:r>
+                    </m:sup>
+                  </m:sSubSup>
+                  <m:r>
+                    <m:rPr>
+                      <m:sty m:val="p"/>
+                    </m:rPr>
+                    <m:t>,</m:t>
+                  </m:r>
+                  <m:sSubSup>
+                    <m:e>
+                      <m:r>
+                        <m:t>z</m:t>
+                      </m:r>
+                    </m:e>
+                    <m:sub>
+                      <m:r>
+                        <m:t>t</m:t>
+                      </m:r>
+                    </m:sub>
+                    <m:sup>
+                      <m:r>
+                        <m:t>m</m:t>
+                      </m:r>
+                    </m:sup>
+                  </m:sSubSup>
+                </m:e>
+              </m:d>
+            </m:oMath>
+            <w:r>
+              <w:rPr>
+                <w:sz w:val="21"/>
+              </w:rPr>
+              <w:t xml:space="preserve"> </w:t>
+            </w:r>
+            <w:r>
+              <w:rPr>
+                <w:sz w:val="21"/>
+              </w:rPr>
+              <w:t xml:space="preserve">共23维</w:t>
+            </w:r>
+          </w:p>
+        </w:tc>
+        <w:tc>
+          <w:tcPr/>
+          <w:p>
+            <w:pPr>
+              <w:pStyle w:val="Compact"/>
+              <w:keepNext/>
+              <w:ind w:firstLine="0"/>
+              <w:jc w:val="left"/>
+            </w:pPr>
+            <w:r>
+              <w:rPr>
+                <w:sz w:val="21"/>
+              </w:rPr>
+              <w:t xml:space="preserve">23→64→45</w:t>
+            </w:r>
+          </w:p>
+        </w:tc>
+        <w:tc>
+          <w:tcPr/>
+          <w:p>
+            <w:pPr>
+              <w:pStyle w:val="Compact"/>
+              <w:keepNext/>
+              <w:ind w:firstLine="0"/>
+              <w:jc w:val="left"/>
+            </w:pPr>
+            <w:r>
+              <w:rPr>
+                <w:sz w:val="21"/>
+              </w:rPr>
+              <w:t xml:space="preserve">预测下一控制周期的本体观测</w:t>
+            </w:r>
+          </w:p>
+        </w:tc>
+      </w:tr>
+      <w:tr>
+        <w:tc>
+          <w:tcPr/>
+          <w:p>
+            <w:pPr>
+              <w:pStyle w:val="Compact"/>
+              <w:keepNext/>
+              <w:ind w:firstLine="0"/>
+              <w:jc w:val="left"/>
+            </w:pPr>
+            <w:r>
+              <w:rPr>
+                <w:sz w:val="21"/>
+              </w:rPr>
+              <w:t xml:space="preserve">地形方差头</w:t>
+            </w:r>
+          </w:p>
+        </w:tc>
+        <w:tc>
+          <w:tcPr/>
+          <w:p>
+            <w:pPr>
+              <w:pStyle w:val="Compact"/>
+              <w:keepNext/>
+              <w:ind w:firstLine="0"/>
+              <w:jc w:val="left"/>
+            </w:pPr>
+            <w:r>
+              <w:rPr>
+                <w:sz w:val="21"/>
+              </w:rPr>
+              <w:t xml:space="preserve">地形预测头输出64</w:t>
+            </w:r>
+          </w:p>
+        </w:tc>
+        <w:tc>
+          <w:tcPr/>
+          <w:p>
+            <w:pPr>
+              <w:pStyle w:val="Compact"/>
+              <w:keepNext/>
+              <w:ind w:firstLine="0"/>
+              <w:jc w:val="left"/>
+            </w:pPr>
+            <w:r>
+              <w:rPr>
+                <w:sz w:val="21"/>
+              </w:rPr>
+              <w:t xml:space="preserve">64→16</w:t>
+            </w:r>
+          </w:p>
+        </w:tc>
+        <w:tc>
+          <w:tcPr/>
+          <w:p>
+            <w:pPr>
+              <w:pStyle w:val="Compact"/>
+              <w:keepNext/>
+              <w:ind w:firstLine="0"/>
+              <w:jc w:val="left"/>
+            </w:pPr>
+            <w:r>
+              <w:rPr>
+                <w:sz w:val="21"/>
+              </w:rPr>
+              <w:t xml:space="preserve">地形潜变量的对数方差</w:t>
+            </w:r>
+          </w:p>
+        </w:tc>
+      </w:tr>
+      <w:tr>
+        <w:tc>
+          <w:tcPr/>
+          <w:p>
+            <w:pPr>
+              <w:pStyle w:val="Compact"/>
+              <w:keepNext/>
+              <w:ind w:firstLine="0"/>
+              <w:jc w:val="left"/>
+            </w:pPr>
+            <w:r>
+              <w:rPr>
+                <w:sz w:val="21"/>
+              </w:rPr>
+              <w:t xml:space="preserve">地形观测解码器</w:t>
+            </w:r>
+          </w:p>
+        </w:tc>
+        <w:tc>
+          <w:tcPr/>
+          <w:p>
+            <w:pPr>
+              <w:pStyle w:val="Compact"/>
+              <w:keepNext/>
+              <w:ind w:firstLine="0"/>
+              <w:jc w:val="left"/>
+            </w:pPr>
+            <w:r>
+              <w:rPr>
+                <w:sz w:val="21"/>
+              </w:rPr>
+              <w:t xml:space="preserve">地形潜变量采样16</w:t>
+            </w:r>
+          </w:p>
+        </w:tc>
+        <w:tc>
+          <w:tcPr/>
+          <w:p>
+            <w:pPr>
+              <w:pStyle w:val="Compact"/>
+              <w:keepNext/>
+              <w:ind w:firstLine="0"/>
+              <w:jc w:val="left"/>
+            </w:pPr>
+            <w:r>
+              <w:rPr>
+                <w:sz w:val="21"/>
+              </w:rPr>
+              <w:t xml:space="preserve">16→64→45</w:t>
+            </w:r>
+          </w:p>
+        </w:tc>
+        <w:tc>
+          <w:tcPr/>
+          <w:p>
+            <w:pPr>
+              <w:pStyle w:val="Compact"/>
+              <w:keepNext/>
+              <w:ind w:firstLine="0"/>
+              <w:jc w:val="left"/>
+            </w:pPr>
+            <w:r>
+              <w:rPr>
+                <w:sz w:val="21"/>
+              </w:rPr>
+              <w:t xml:space="preserve">再预测一次下一控制周期的本体观测</w:t>
+            </w:r>
+          </w:p>
+        </w:tc>
+      </w:tr>
+      <w:tr>
+        <w:tc>
+          <w:tcPr/>
+          <w:p>
+            <w:pPr>
+              <w:pStyle w:val="Compact"/>
+              <w:keepNext/>
+              <w:ind w:firstLine="0"/>
+              <w:jc w:val="left"/>
+            </w:pPr>
+            <w:r>
+              <w:rPr>
+                <w:sz w:val="21"/>
+              </w:rPr>
+              <w:t xml:space="preserve">高度图解码器</w:t>
+            </w:r>
+          </w:p>
+        </w:tc>
+        <w:tc>
+          <w:tcPr/>
+          <w:p>
+            <w:pPr>
+              <w:pStyle w:val="Compact"/>
+              <w:keepNext/>
+              <w:ind w:firstLine="0"/>
+              <w:jc w:val="left"/>
+            </w:pPr>
+            <m:oMath>
+              <m:sSubSup>
+                <m:e>
+                  <m:r>
+                    <m:t>z</m:t>
+                  </m:r>
+                </m:e>
+                <m:sub>
+                  <m:r>
+                    <m:t>t</m:t>
+                  </m:r>
+                </m:sub>
+                <m:sup>
+                  <m:r>
+                    <m:t>t</m:t>
+                  </m:r>
+                  <m:r>
+                    <m:t>m</m:t>
+                  </m:r>
+                </m:sup>
+              </m:sSubSup>
+            </m:oMath>
+            <w:r>
+              <w:rPr>
+                <w:sz w:val="21"/>
+              </w:rPr>
+              <w:t xml:space="preserve"> </w:t>
+            </w:r>
+            <w:r>
+              <w:rPr>
+                <w:sz w:val="21"/>
+              </w:rPr>
+              <w:t xml:space="preserve">32</w:t>
+            </w:r>
+          </w:p>
+        </w:tc>
+        <w:tc>
+          <w:tcPr/>
+          <w:p>
+            <w:pPr>
+              <w:pStyle w:val="Compact"/>
+              <w:keepNext/>
+              <w:ind w:firstLine="0"/>
+              <w:jc w:val="left"/>
+            </w:pPr>
+            <w:r>
+              <w:rPr>
+                <w:sz w:val="21"/>
+              </w:rPr>
+              <w:t xml:space="preserve">32→64→187</w:t>
+            </w:r>
+          </w:p>
+        </w:tc>
+        <w:tc>
+          <w:tcPr/>
+          <w:p>
+            <w:pPr>
+              <w:pStyle w:val="Compact"/>
+              <w:keepNext/>
+              <w:ind w:firstLine="0"/>
+              <w:jc w:val="left"/>
+            </w:pPr>
+            <w:r>
+              <w:rPr>
+                <w:sz w:val="21"/>
+              </w:rPr>
+              <w:t xml:space="preserve">重建机器人周围187点的地形高度</w:t>
+            </w:r>
+          </w:p>
+        </w:tc>
+      </w:tr>
+      <w:tr>
+        <w:tc>
+          <w:tcPr/>
+          <w:p>
+            <w:pPr>
+              <w:pStyle w:val="Compact"/>
+              <w:ind w:firstLine="0"/>
+              <w:jc w:val="left"/>
+            </w:pPr>
+            <w:r>
+              <w:rPr>
+                <w:sz w:val="21"/>
+              </w:rPr>
+              <w:t xml:space="preserve">SwAV投影头</w:t>
+            </w:r>
+          </w:p>
+        </w:tc>
+        <w:tc>
+          <w:tcPr/>
+          <w:p>
+            <w:pPr>
+              <w:pStyle w:val="Compact"/>
+              <w:ind w:firstLine="0"/>
+              <w:jc w:val="left"/>
+            </w:pPr>
+            <w:r>
+              <w:rPr>
+                <w:sz w:val="21"/>
+              </w:rPr>
+              <w:t xml:space="preserve">门控窗口3 / 特权高度187</w:t>
+            </w:r>
+          </w:p>
+        </w:tc>
+        <w:tc>
+          <w:tcPr/>
+          <w:p>
+            <w:pPr>
+              <w:pStyle w:val="Compact"/>
+              <w:ind w:firstLine="0"/>
+              <w:jc w:val="left"/>
+            </w:pPr>
+            <w:r>
+              <w:rPr>
+                <w:sz w:val="21"/>
+              </w:rPr>
+              <w:t xml:space="preserve">3→64→32，187→64→32，16个原型</w:t>
+            </w:r>
+          </w:p>
+        </w:tc>
+        <w:tc>
+          <w:tcPr/>
+          <w:p>
+            <w:pPr>
+              <w:pStyle w:val="Compact"/>
+              <w:ind w:firstLine="0"/>
+              <w:jc w:val="left"/>
+            </w:pPr>
+            <w:r>
+              <w:rPr>
+                <w:sz w:val="21"/>
+              </w:rPr>
+              <w:t xml:space="preserve">门控与真实地形的聚类一致性</w:t>
+            </w:r>
+          </w:p>
+        </w:tc>
+      </w:tr>
+    </w:tbl>
+    <w:p>
+      <w:pPr>
+        <w:pStyle w:val="BodyText"/>
+        <w:spacing w:before="180"/>
+      </w:pPr>
+      <w:r>
+        <w:t xml:space="preserve">训练时两个潜变量用重参数化方式采样后送入解码器，控制码中只使用均值。估计器的总损失为</w:t>
       </w:r>
     </w:p>
     <w:p>
@@ -4403,11 +5760,13 @@
           </m:e>
           <m:sub>
             <m:r>
-              <m:rPr>
-                <m:nor/>
-                <m:sty m:val="p"/>
-              </m:rPr>
-              <m:t>est</m:t>
+              <m:t>e</m:t>
+            </m:r>
+            <m:r>
+              <m:t>s</m:t>
+            </m:r>
+            <m:r>
+              <m:t>t</m:t>
             </m:r>
           </m:sub>
         </m:sSub>
@@ -4473,11 +5832,13 @@
           </m:e>
           <m:sub>
             <m:r>
-              <m:rPr>
-                <m:nor/>
-                <m:sty m:val="p"/>
-              </m:rPr>
-              <m:t>map</m:t>
+              <m:t>m</m:t>
+            </m:r>
+            <m:r>
+              <m:t>a</m:t>
+            </m:r>
+            <m:r>
+              <m:t>p</m:t>
             </m:r>
           </m:sub>
         </m:sSub>
@@ -4510,11 +5871,13 @@
               </m:e>
               <m:sub>
                 <m:r>
-                  <m:rPr>
-                    <m:nor/>
-                    <m:sty m:val="p"/>
-                  </m:rPr>
-                  <m:t>obs</m:t>
+                  <m:t>o</m:t>
+                </m:r>
+                <m:r>
+                  <m:t>b</m:t>
+                </m:r>
+                <m:r>
+                  <m:t>s</m:t>
                 </m:r>
               </m:sub>
               <m:sup>
@@ -4541,11 +5904,13 @@
               </m:e>
               <m:sub>
                 <m:r>
-                  <m:rPr>
-                    <m:nor/>
-                    <m:sty m:val="p"/>
-                  </m:rPr>
-                  <m:t>obs</m:t>
+                  <m:t>o</m:t>
+                </m:r>
+                <m:r>
+                  <m:t>b</m:t>
+                </m:r>
+                <m:r>
+                  <m:t>s</m:t>
                 </m:r>
               </m:sub>
               <m:sup>
@@ -4574,11 +5939,10 @@
           </m:e>
           <m:sub>
             <m:r>
-              <m:rPr>
-                <m:nor/>
-                <m:sty m:val="p"/>
-              </m:rPr>
-              <m:t>CE</m:t>
+              <m:t>C</m:t>
+            </m:r>
+            <m:r>
+              <m:t>E</m:t>
             </m:r>
           </m:sub>
         </m:sSub>
@@ -4600,11 +5964,13 @@
           </m:e>
           <m:sub>
             <m:r>
-              <m:rPr>
-                <m:nor/>
-                <m:sty m:val="p"/>
-              </m:rPr>
-              <m:t>BCE</m:t>
+              <m:t>B</m:t>
+            </m:r>
+            <m:r>
+              <m:t>C</m:t>
+            </m:r>
+            <m:r>
+              <m:t>E</m:t>
             </m:r>
           </m:sub>
         </m:sSub>
@@ -4632,11 +5998,19 @@
           </m:e>
           <m:sub>
             <m:r>
-              <m:rPr>
-                <m:nor/>
-                <m:sty m:val="p"/>
-              </m:rPr>
-              <m:t>patch</m:t>
+              <m:t>p</m:t>
+            </m:r>
+            <m:r>
+              <m:t>a</m:t>
+            </m:r>
+            <m:r>
+              <m:t>t</m:t>
+            </m:r>
+            <m:r>
+              <m:t>c</m:t>
+            </m:r>
+            <m:r>
+              <m:t>h</m:t>
             </m:r>
           </m:sub>
         </m:sSub>
@@ -4664,11 +6038,10 @@
           </m:e>
           <m:sub>
             <m:r>
-              <m:rPr>
-                <m:nor/>
-                <m:sty m:val="p"/>
-              </m:rPr>
-              <m:t>KL</m:t>
+              <m:t>K</m:t>
+            </m:r>
+            <m:r>
+              <m:t>L</m:t>
             </m:r>
           </m:sub>
         </m:sSub>
@@ -4696,11 +6069,16 @@
           </m:e>
           <m:sub>
             <m:r>
-              <m:rPr>
-                <m:nor/>
-                <m:sty m:val="p"/>
-              </m:rPr>
-              <m:t>SwAV</m:t>
+              <m:t>S</m:t>
+            </m:r>
+            <m:r>
+              <m:t>w</m:t>
+            </m:r>
+            <m:r>
+              <m:t>A</m:t>
+            </m:r>
+            <m:r>
+              <m:t>V</m:t>
             </m:r>
           </m:sub>
         </m:sSub>
@@ -4717,7 +6095,7 @@
         <w:pStyle w:val="FirstParagraph"/>
       </w:pPr>
       <w:r>
-        <w:t xml:space="preserve">各项的含义见表2。其中</w:t>
+        <w:t xml:space="preserve">各项的监督信号和权重见表3。其中</w:t>
       </w:r>
       <w:r>
         <w:t xml:space="preserve"> </w:t>
@@ -4735,11 +6113,13 @@
           </m:e>
           <m:sub>
             <m:r>
-              <m:rPr>
-                <m:nor/>
-                <m:sty m:val="p"/>
-              </m:rPr>
-              <m:t>map</m:t>
+              <m:t>m</m:t>
+            </m:r>
+            <m:r>
+              <m:t>a</m:t>
+            </m:r>
+            <m:r>
+              <m:t>p</m:t>
             </m:r>
           </m:sub>
         </m:sSub>
@@ -4748,7 +6128,7 @@
         <w:t xml:space="preserve"> </w:t>
       </w:r>
       <w:r>
-        <w:t xml:space="preserve">要求</w:t>
+        <w:t xml:space="preserve">是</w:t>
       </w:r>
       <w:r>
         <w:t xml:space="preserve"> </w:t>
@@ -4767,11 +6147,10 @@
           </m:sub>
           <m:sup>
             <m:r>
-              <m:rPr>
-                <m:nor/>
-                <m:sty m:val="p"/>
-              </m:rPr>
-              <m:t>tm</m:t>
+              <m:t>t</m:t>
+            </m:r>
+            <m:r>
+              <m:t>m</m:t>
             </m:r>
           </m:sup>
         </m:sSubSup>
@@ -4780,47 +6159,16 @@
         <w:t xml:space="preserve"> </w:t>
       </w:r>
       <w:r>
-        <w:t xml:space="preserve">经解码器（32→64→187）重建机器人周围187个点的高度采样，这一项是</w:t>
-      </w:r>
-      <w:r>
-        <w:t xml:space="preserve"> </w:t>
-      </w:r>
-      <m:oMath>
-        <m:sSubSup>
-          <m:e>
-            <m:r>
-              <m:t>z</m:t>
-            </m:r>
-          </m:e>
-          <m:sub>
-            <m:r>
-              <m:t>t</m:t>
-            </m:r>
-          </m:sub>
-          <m:sup>
-            <m:r>
-              <m:rPr>
-                <m:nor/>
-                <m:sty m:val="p"/>
-              </m:rPr>
-              <m:t>tm</m:t>
-            </m:r>
-          </m:sup>
-        </m:sSubSup>
-      </m:oMath>
-      <w:r>
-        <w:t xml:space="preserve"> </w:t>
-      </w:r>
-      <w:r>
-        <w:t xml:space="preserve">成为”局部地图编码”的主要原因；两个下一观测预测项要求网络能预测执行动作后一个控制周期的本体观测，相当于让估计器学习一个简单的前向模型。SwAV项[7]将3维专家门控窗口与特权地形高度窗口投影到同一个32维空间，用16个原型做交换聚类，使专家路由与真实地形结构对应起来。</w:t>
+        <w:t xml:space="preserve">成为”局部地图编码”的主要原因；两个下一观测预测项要求网络能预测执行动作后一个控制周期的本体观测，相当于让估计器学习一个简单的前向模型。SwAV项将3维专家门控窗口与特权地形高度窗口投影到同一个32维空间，用16个原型做交换聚类，使专家路由与真实地形结构对应起来。</w:t>
       </w:r>
     </w:p>
     <w:p>
       <w:pPr>
         <w:pStyle w:val="TableCaption"/>
+        <w:keepNext/>
       </w:pPr>
       <w:r>
-        <w:t xml:space="preserve">表2 估计器监督目标</w:t>
+        <w:t xml:space="preserve">表3 估计器监督目标</w:t>
       </w:r>
     </w:p>
     <w:tbl>
@@ -4828,7 +6176,7 @@
         <w:tblW w:type="pct" w:w="5000"/>
         <w:tblLook w:firstRow="1" w:lastRow="0" w:firstColumn="0" w:lastColumn="0" w:noHBand="0" w:noVBand="0" w:val="0020"/>
         <w:jc w:val="start"/>
-        <w:tblCaption w:val="表2 估计器监督目标"/>
+        <w:tblCaption w:val="表3 估计器监督目标"/>
         <w:tblBorders>
           <w:top w:val="single" w:sz="12" w:space="0" w:color="000000"/>
           <w:left w:val="nil"/>
@@ -4857,6 +6205,7 @@
           <w:p>
             <w:pPr>
               <w:pStyle w:val="Compact"/>
+              <w:keepNext/>
               <w:ind w:firstLine="0"/>
               <w:jc w:val="left"/>
             </w:pPr>
@@ -4878,6 +6227,7 @@
           <w:p>
             <w:pPr>
               <w:pStyle w:val="Compact"/>
+              <w:keepNext/>
               <w:ind w:firstLine="0"/>
               <w:jc w:val="left"/>
             </w:pPr>
@@ -4899,6 +6249,7 @@
           <w:p>
             <w:pPr>
               <w:pStyle w:val="Compact"/>
+              <w:keepNext/>
               <w:ind w:firstLine="0"/>
               <w:jc w:val="left"/>
             </w:pPr>
@@ -4918,6 +6269,7 @@
           <w:p>
             <w:pPr>
               <w:pStyle w:val="Compact"/>
+              <w:keepNext/>
               <w:ind w:firstLine="0"/>
               <w:jc w:val="left"/>
             </w:pPr>
@@ -4976,6 +6328,7 @@
           <w:p>
             <w:pPr>
               <w:pStyle w:val="Compact"/>
+              <w:keepNext/>
               <w:ind w:firstLine="0"/>
               <w:jc w:val="left"/>
             </w:pPr>
@@ -4992,6 +6345,7 @@
           <w:p>
             <w:pPr>
               <w:pStyle w:val="Compact"/>
+              <w:keepNext/>
               <w:ind w:firstLine="0"/>
               <w:jc w:val="left"/>
             </w:pPr>
@@ -5010,6 +6364,7 @@
           <w:p>
             <w:pPr>
               <w:pStyle w:val="Compact"/>
+              <w:keepNext/>
               <w:ind w:firstLine="0"/>
               <w:jc w:val="left"/>
             </w:pPr>
@@ -5026,11 +6381,13 @@
                 </m:e>
                 <m:sub>
                   <m:r>
-                    <m:rPr>
-                      <m:nor/>
-                      <m:sty m:val="p"/>
-                    </m:rPr>
-                    <m:t>map</m:t>
+                    <m:t>m</m:t>
+                  </m:r>
+                  <m:r>
+                    <m:t>a</m:t>
+                  </m:r>
+                  <m:r>
+                    <m:t>p</m:t>
                   </m:r>
                 </m:sub>
               </m:sSub>
@@ -5042,6 +6399,7 @@
           <w:p>
             <w:pPr>
               <w:pStyle w:val="Compact"/>
+              <w:keepNext/>
               <w:ind w:firstLine="0"/>
               <w:jc w:val="left"/>
             </w:pPr>
@@ -5058,6 +6416,7 @@
           <w:p>
             <w:pPr>
               <w:pStyle w:val="Compact"/>
+              <w:keepNext/>
               <w:ind w:firstLine="0"/>
               <w:jc w:val="left"/>
             </w:pPr>
@@ -5076,6 +6435,7 @@
           <w:p>
             <w:pPr>
               <w:pStyle w:val="Compact"/>
+              <w:keepNext/>
               <w:ind w:firstLine="0"/>
               <w:jc w:val="left"/>
             </w:pPr>
@@ -5092,11 +6452,13 @@
                 </m:e>
                 <m:sub>
                   <m:r>
-                    <m:rPr>
-                      <m:nor/>
-                      <m:sty m:val="p"/>
-                    </m:rPr>
-                    <m:t>obs</m:t>
+                    <m:t>o</m:t>
+                  </m:r>
+                  <m:r>
+                    <m:t>b</m:t>
+                  </m:r>
+                  <m:r>
+                    <m:t>s</m:t>
                   </m:r>
                 </m:sub>
                 <m:sup>
@@ -5131,11 +6493,13 @@
                 </m:e>
                 <m:sub>
                   <m:r>
-                    <m:rPr>
-                      <m:nor/>
-                      <m:sty m:val="p"/>
-                    </m:rPr>
-                    <m:t>obs</m:t>
+                    <m:t>o</m:t>
+                  </m:r>
+                  <m:r>
+                    <m:t>b</m:t>
+                  </m:r>
+                  <m:r>
+                    <m:t>s</m:t>
                   </m:r>
                 </m:sub>
                 <m:sup>
@@ -5152,6 +6516,7 @@
           <w:p>
             <w:pPr>
               <w:pStyle w:val="Compact"/>
+              <w:keepNext/>
               <w:ind w:firstLine="0"/>
               <w:jc w:val="left"/>
             </w:pPr>
@@ -5168,6 +6533,7 @@
           <w:p>
             <w:pPr>
               <w:pStyle w:val="Compact"/>
+              <w:keepNext/>
               <w:ind w:firstLine="0"/>
               <w:jc w:val="left"/>
             </w:pPr>
@@ -5186,6 +6552,7 @@
           <w:p>
             <w:pPr>
               <w:pStyle w:val="Compact"/>
+              <w:keepNext/>
               <w:ind w:firstLine="0"/>
               <w:jc w:val="left"/>
             </w:pPr>
@@ -5202,11 +6569,10 @@
                 </m:e>
                 <m:sub>
                   <m:r>
-                    <m:rPr>
-                      <m:nor/>
-                      <m:sty m:val="p"/>
-                    </m:rPr>
-                    <m:t>CE</m:t>
+                    <m:t>C</m:t>
+                  </m:r>
+                  <m:r>
+                    <m:t>E</m:t>
                   </m:r>
                 </m:sub>
               </m:sSub>
@@ -5236,11 +6602,13 @@
                 </m:e>
                 <m:sub>
                   <m:r>
-                    <m:rPr>
-                      <m:nor/>
-                      <m:sty m:val="p"/>
-                    </m:rPr>
-                    <m:t>BCE</m:t>
+                    <m:t>B</m:t>
+                  </m:r>
+                  <m:r>
+                    <m:t>C</m:t>
+                  </m:r>
+                  <m:r>
+                    <m:t>E</m:t>
                   </m:r>
                 </m:sub>
               </m:sSub>
@@ -5252,6 +6620,7 @@
           <w:p>
             <w:pPr>
               <w:pStyle w:val="Compact"/>
+              <w:keepNext/>
               <w:ind w:firstLine="0"/>
               <w:jc w:val="left"/>
             </w:pPr>
@@ -5268,6 +6637,7 @@
           <w:p>
             <w:pPr>
               <w:pStyle w:val="Compact"/>
+              <w:keepNext/>
               <w:ind w:firstLine="0"/>
               <w:jc w:val="left"/>
             </w:pPr>
@@ -5286,6 +6656,7 @@
           <w:p>
             <w:pPr>
               <w:pStyle w:val="Compact"/>
+              <w:keepNext/>
               <w:ind w:firstLine="0"/>
               <w:jc w:val="left"/>
             </w:pPr>
@@ -5302,11 +6673,19 @@
                 </m:e>
                 <m:sub>
                   <m:r>
-                    <m:rPr>
-                      <m:nor/>
-                      <m:sty m:val="p"/>
-                    </m:rPr>
-                    <m:t>patch</m:t>
+                    <m:t>p</m:t>
+                  </m:r>
+                  <m:r>
+                    <m:t>a</m:t>
+                  </m:r>
+                  <m:r>
+                    <m:t>t</m:t>
+                  </m:r>
+                  <m:r>
+                    <m:t>c</m:t>
+                  </m:r>
+                  <m:r>
+                    <m:t>h</m:t>
                   </m:r>
                 </m:sub>
               </m:sSub>
@@ -5318,6 +6697,7 @@
           <w:p>
             <w:pPr>
               <w:pStyle w:val="Compact"/>
+              <w:keepNext/>
               <w:ind w:firstLine="0"/>
               <w:jc w:val="left"/>
             </w:pPr>
@@ -5334,6 +6714,7 @@
           <w:p>
             <w:pPr>
               <w:pStyle w:val="Compact"/>
+              <w:keepNext/>
               <w:ind w:firstLine="0"/>
               <w:jc w:val="left"/>
             </w:pPr>
@@ -5352,6 +6733,7 @@
           <w:p>
             <w:pPr>
               <w:pStyle w:val="Compact"/>
+              <w:keepNext/>
               <w:ind w:firstLine="0"/>
               <w:jc w:val="left"/>
             </w:pPr>
@@ -5368,11 +6750,10 @@
                 </m:e>
                 <m:sub>
                   <m:r>
-                    <m:rPr>
-                      <m:nor/>
-                      <m:sty m:val="p"/>
-                    </m:rPr>
-                    <m:t>KL</m:t>
+                    <m:t>K</m:t>
+                  </m:r>
+                  <m:r>
+                    <m:t>L</m:t>
                   </m:r>
                 </m:sub>
               </m:sSub>
@@ -5384,6 +6765,7 @@
           <w:p>
             <w:pPr>
               <w:pStyle w:val="Compact"/>
+              <w:keepNext/>
               <w:ind w:firstLine="0"/>
               <w:jc w:val="left"/>
             </w:pPr>
@@ -5400,6 +6782,7 @@
           <w:p>
             <w:pPr>
               <w:pStyle w:val="Compact"/>
+              <w:keepNext/>
               <w:ind w:firstLine="0"/>
               <w:jc w:val="left"/>
             </w:pPr>
@@ -5434,11 +6817,16 @@
                 </m:e>
                 <m:sub>
                   <m:r>
-                    <m:rPr>
-                      <m:nor/>
-                      <m:sty m:val="p"/>
-                    </m:rPr>
-                    <m:t>SwAV</m:t>
+                    <m:t>S</m:t>
+                  </m:r>
+                  <m:r>
+                    <m:t>w</m:t>
+                  </m:r>
+                  <m:r>
+                    <m:t>A</m:t>
+                  </m:r>
+                  <m:r>
+                    <m:t>V</m:t>
                   </m:r>
                 </m:sub>
               </m:sSub>
@@ -5630,11 +7018,19 @@
           </m:sub>
           <m:sup>
             <m:r>
-              <m:rPr>
-                <m:nor/>
-                <m:sty m:val="p"/>
-              </m:rPr>
-              <m:t>actor</m:t>
+              <m:t>a</m:t>
+            </m:r>
+            <m:r>
+              <m:t>c</m:t>
+            </m:r>
+            <m:r>
+              <m:t>t</m:t>
+            </m:r>
+            <m:r>
+              <m:t>o</m:t>
+            </m:r>
+            <m:r>
+              <m:t>r</m:t>
             </m:r>
           </m:sup>
         </m:sSubSup>
@@ -5655,24 +7051,6 @@
             <m:sSub>
               <m:e>
                 <m:r>
-                  <m:t>o</m:t>
-                </m:r>
-              </m:e>
-              <m:sub>
-                <m:r>
-                  <m:t>t</m:t>
-                </m:r>
-              </m:sub>
-            </m:sSub>
-            <m:r>
-              <m:rPr>
-                <m:sty m:val="p"/>
-              </m:rPr>
-              <m:t>,</m:t>
-            </m:r>
-            <m:sSub>
-              <m:e>
-                <m:r>
                   <m:rPr>
                     <m:nor/>
                     <m:sty m:val="p"/>
@@ -5704,6 +7082,24 @@
                 </m:r>
               </m:sub>
             </m:sSub>
+            <m:r>
+              <m:rPr>
+                <m:sty m:val="p"/>
+              </m:rPr>
+              <m:t>,</m:t>
+            </m:r>
+            <m:sSub>
+              <m:e>
+                <m:r>
+                  <m:t>o</m:t>
+                </m:r>
+              </m:e>
+              <m:sub>
+                <m:r>
+                  <m:t>t</m:t>
+                </m:r>
+              </m:sub>
+            </m:sSub>
           </m:e>
         </m:d>
         <m:r>
@@ -5730,7 +7126,7 @@
         </m:sSup>
       </m:oMath>
       <w:r>
-        <w:t xml:space="preserve">。共享MLP（115→512→256→1024）一次输出1024维特征，按通道重排为8×128，再用8组的分组一维卷积把每组128维映射为12维，得到8个专家各自的动作建议</w:t>
+        <w:t xml:space="preserve">。共享MLP（115→512→256→1024，每层后接ELU）一次输出1024维特征，按通道重排为8×128，再用8组的分组一维卷积（卷积核大小为1）把每组128维映射为12维，得到8个专家各自的动作建议</w:t>
       </w:r>
       <w:r>
         <w:t xml:space="preserve"> </w:t>
@@ -5763,7 +7159,7 @@
         </m:d>
       </m:oMath>
       <w:r>
-        <w:t xml:space="preserve">。这种写法在计算上等价于8个小型专家头，但只需一次矩阵运算。另一个门控MLP根据同样的输入给出8个专家的权重，最终动作均值为</w:t>
+        <w:t xml:space="preserve">。这种写法在计算上等价于8个独立的线性专家头，但只需一次运算。另一个门控MLP（115→512→256→8）根据同样的输入给出8个专家的权重，最终动作均值为</w:t>
       </w:r>
     </w:p>
     <w:p>
@@ -5884,11 +7280,19 @@
               </m:sub>
               <m:sup>
                 <m:r>
-                  <m:rPr>
-                    <m:nor/>
-                    <m:sty m:val="p"/>
-                  </m:rPr>
-                  <m:t>actor</m:t>
+                  <m:t>a</m:t>
+                </m:r>
+                <m:r>
+                  <m:t>c</m:t>
+                </m:r>
+                <m:r>
+                  <m:t>t</m:t>
+                </m:r>
+                <m:r>
+                  <m:t>o</m:t>
+                </m:r>
+                <m:r>
+                  <m:t>r</m:t>
                 </m:r>
               </m:sup>
             </m:sSubSup>
@@ -5969,11 +7373,19 @@
                   </m:sub>
                   <m:sup>
                     <m:r>
-                      <m:rPr>
-                        <m:nor/>
-                        <m:sty m:val="p"/>
-                      </m:rPr>
-                      <m:t>actor</m:t>
+                      <m:t>a</m:t>
+                    </m:r>
+                    <m:r>
+                      <m:t>c</m:t>
+                    </m:r>
+                    <m:r>
+                      <m:t>t</m:t>
+                    </m:r>
+                    <m:r>
+                      <m:t>o</m:t>
+                    </m:r>
+                    <m:r>
+                      <m:t>r</m:t>
                     </m:r>
                   </m:sup>
                 </m:sSubSup>
@@ -6017,7 +7429,7 @@
         <w:t xml:space="preserve"> </w:t>
       </w:r>
       <w:r>
-        <w:t xml:space="preserve">为均值的对角高斯分布，12个标准差为独立的可学习参数；部署时直接取</w:t>
+        <w:t xml:space="preserve">为均值的对角高斯分布，12个标准差为独立的可学习参数，初始值为1；部署时直接取</w:t>
       </w:r>
       <w:r>
         <w:t xml:space="preserve"> </w:t>
@@ -6063,7 +7475,7 @@
         <w:pStyle w:val="BodyText"/>
       </w:pPr>
       <w:r>
-        <w:t xml:space="preserve">软路由的一个常见问题是门控坍缩到少数几个专家上，其余专家得不到训练。为此在PPO损失中加入批次级负载均衡项[8]：</w:t>
+        <w:t xml:space="preserve">软路由的一个常见问题是门控坍缩到少数几个专家上，其余专家得不到训练。为此在PPO损失中加入批次级负载均衡项：</w:t>
       </w:r>
     </w:p>
     <w:p>
@@ -6191,11 +7603,10 @@
           </m:e>
           <m:sub>
             <m:r>
-              <m:rPr>
-                <m:nor/>
-                <m:sty m:val="p"/>
-              </m:rPr>
-              <m:t>lb</m:t>
+              <m:t>l</m:t>
+            </m:r>
+            <m:r>
+              <m:t>b</m:t>
             </m:r>
           </m:sub>
         </m:sSub>
@@ -6341,7 +7752,7 @@
         <w:t xml:space="preserve"> </w:t>
       </w:r>
       <w:r>
-        <w:t xml:space="preserve">Critic采用非对称设计[9]，输入为269维特权观测加视觉标志共270维，包括真实线速度、角速度、关节状态、四足接触力、关节力矩、187点地形高度、四足离地高度、地形编号和恢复标志等。这些量在仿真里可以直接读取，让Critic看到更完整的状态，价值估计会更准确，从而降低优势估计的方差。Critic同样由共享MLP和分组卷积构成8个价值专家，加权所用的权重</w:t>
+        <w:t xml:space="preserve">Critic采用非对称设计，输入为269维特权观测加视觉标志共270维，包括真实线速度、角速度、关节状态、四足接触力、关节力矩、187点地形高度、四足离地高度、地形编号和恢复标志等。这些量在仿真里可以直接读取，让Critic看到更完整的状态，价值估计会更准确，从而降低优势估计的方差。Critic同样由共享MLP（270→512→256→1024）和分组卷积构成8个价值专家，每个专家输出一个标量</w:t>
       </w:r>
       <w:r>
         <w:t xml:space="preserve"> </w:t>
@@ -6350,21 +7761,41 @@
         <m:sSub>
           <m:e>
             <m:r>
-              <m:t>ρ</m:t>
-            </m:r>
-          </m:e>
-          <m:sub>
-            <m:r>
-              <m:t>t</m:t>
+              <m:t>V</m:t>
+            </m:r>
+          </m:e>
+          <m:sub>
+            <m:r>
+              <m:t>i</m:t>
             </m:r>
           </m:sub>
         </m:sSub>
       </m:oMath>
       <w:r>
-        <w:t xml:space="preserve"> </w:t>
-      </w:r>
-      <w:r>
-        <w:t xml:space="preserve">由Actor门控在Actor输入上重新计算，两者的专家划分保持一致。Critic只参与训练，导出部署模型时不包含这一部分。</w:t>
+        <w:t xml:space="preserve">。加权所用的权重</w:t>
+      </w:r>
+      <w:r>
+        <w:t xml:space="preserve"> </w:t>
+      </w:r>
+      <m:oMath>
+        <m:sSub>
+          <m:e>
+            <m:r>
+              <m:t>ρ</m:t>
+            </m:r>
+          </m:e>
+          <m:sub>
+            <m:r>
+              <m:t>t</m:t>
+            </m:r>
+          </m:sub>
+        </m:sSub>
+      </m:oMath>
+      <w:r>
+        <w:t xml:space="preserve"> </w:t>
+      </w:r>
+      <w:r>
+        <w:t xml:space="preserve">不由Critic自己计算，而是用Actor的门控网络在Actor输入上重新算一次，因此价值损失的梯度也会传到Actor的门控网络上。Critic只参与训练，导出部署模型时不包含这一部分。</w:t>
       </w:r>
     </w:p>
     <w:bookmarkEnd w:id="36"/>
@@ -6392,15 +7823,16 @@
         <w:t xml:space="preserve"> </w:t>
       </w:r>
       <w:r>
-        <w:t xml:space="preserve">总奖励是若干奖励项的加权和，各项权重在初始化时乘以控制周期0.02 s。按作用可以分为四类，主要项及其权重列于表3。速度跟踪项是正向激励的主体；稳定性和能耗项约束机身姿态、关节力矩与动作平滑程度；地形通行项只在特定地形上生效，例如窄桥上的步宽奖励、台阶上前后足的支撑转移奖励，以及根据前方地形扫描结果计算的目标落脚点奖励。</w:t>
+        <w:t xml:space="preserve">总奖励是若干奖励项的加权和，各项权重在初始化时乘以控制周期0.02 s。按作用可以分为四类，主要项及其权重列于表4。速度跟踪项是正向激励的主体；稳定性和能耗项约束机身姿态、关节力矩与动作平滑程度；地形通行项只在特定地形上生效，例如窄桥上的步宽奖励、台阶上前后足的支撑转移奖励，以及根据前方地形扫描结果计算的目标落脚点奖励。</w:t>
       </w:r>
     </w:p>
     <w:p>
       <w:pPr>
         <w:pStyle w:val="TableCaption"/>
+        <w:keepNext/>
       </w:pPr>
       <w:r>
-        <w:t xml:space="preserve">表3 主要奖励项</w:t>
+        <w:t xml:space="preserve">表4 主要奖励项</w:t>
       </w:r>
     </w:p>
     <w:tbl>
@@ -6408,7 +7840,7 @@
         <w:tblW w:type="pct" w:w="5000"/>
         <w:tblLook w:firstRow="1" w:lastRow="0" w:firstColumn="0" w:lastColumn="0" w:noHBand="0" w:noVBand="0" w:val="0020"/>
         <w:jc w:val="start"/>
-        <w:tblCaption w:val="表3 主要奖励项"/>
+        <w:tblCaption w:val="表4 主要奖励项"/>
         <w:tblBorders>
           <w:top w:val="single" w:sz="12" w:space="0" w:color="000000"/>
           <w:left w:val="nil"/>
@@ -6436,6 +7868,7 @@
           <w:p>
             <w:pPr>
               <w:pStyle w:val="Compact"/>
+              <w:keepNext/>
               <w:ind w:firstLine="0"/>
               <w:jc w:val="left"/>
             </w:pPr>
@@ -6457,6 +7890,7 @@
           <w:p>
             <w:pPr>
               <w:pStyle w:val="Compact"/>
+              <w:keepNext/>
               <w:ind w:firstLine="0"/>
               <w:jc w:val="left"/>
             </w:pPr>
@@ -6476,6 +7910,7 @@
           <w:p>
             <w:pPr>
               <w:pStyle w:val="Compact"/>
+              <w:keepNext/>
               <w:ind w:firstLine="0"/>
               <w:jc w:val="left"/>
             </w:pPr>
@@ -6492,6 +7927,7 @@
           <w:p>
             <w:pPr>
               <w:pStyle w:val="Compact"/>
+              <w:keepNext/>
               <w:ind w:firstLine="0"/>
               <w:jc w:val="left"/>
             </w:pPr>
@@ -6510,6 +7946,7 @@
           <w:p>
             <w:pPr>
               <w:pStyle w:val="Compact"/>
+              <w:keepNext/>
               <w:ind w:firstLine="0"/>
               <w:jc w:val="left"/>
             </w:pPr>
@@ -6526,6 +7963,7 @@
           <w:p>
             <w:pPr>
               <w:pStyle w:val="Compact"/>
+              <w:keepNext/>
               <w:ind w:firstLine="0"/>
               <w:jc w:val="left"/>
             </w:pPr>
@@ -6544,6 +7982,7 @@
           <w:p>
             <w:pPr>
               <w:pStyle w:val="Compact"/>
+              <w:keepNext/>
               <w:ind w:firstLine="0"/>
               <w:jc w:val="left"/>
             </w:pPr>
@@ -6560,6 +7999,7 @@
           <w:p>
             <w:pPr>
               <w:pStyle w:val="Compact"/>
+              <w:keepNext/>
               <w:ind w:firstLine="0"/>
               <w:jc w:val="left"/>
             </w:pPr>
@@ -6623,15 +8063,16 @@
         <w:t xml:space="preserve"> </w:t>
       </w:r>
       <w:r>
-        <w:t xml:space="preserve">训练地形由10个难度等级、13类地形组成，包括平地、坡面、台阶、窄桥、沟槽和碎石等，每块地形12 m×5 m。训练开始时最高难度为2级，回合结束时根据机器人前进的距离调整等级：走过半块地形（约6 m）则升一级，距离明显不足则降一级。为了缩小仿真与实机之间的差距，训练时对动力学参数做了随机化，范围见表4。</w:t>
+        <w:t xml:space="preserve">训练地形由10个难度等级、13类地形组成，包括平地、粗糙平地、坡面（最大25°）、上台阶、缝隙、单排和双排石块、悬空石块、悬空横梁、窄桥、跨栏和走廊，另有一类踏石地形的采样比例设为0。每块地形12 m×5 m。训练开始时最高难度为2级，回合结束时根据机器人前进的距离调整等级：走过半块地形（约6 m）则升一级，距离明显不足则降一级。为了缩小仿真与实机之间的差距，训练时对动力学参数做了随机化，范围见表5。</w:t>
       </w:r>
     </w:p>
     <w:p>
       <w:pPr>
         <w:pStyle w:val="TableCaption"/>
+        <w:keepNext/>
       </w:pPr>
       <w:r>
-        <w:t xml:space="preserve">表4 域随机化范围</w:t>
+        <w:t xml:space="preserve">表5 域随机化范围</w:t>
       </w:r>
     </w:p>
     <w:tbl>
@@ -6639,7 +8080,7 @@
         <w:tblW w:type="pct" w:w="5000"/>
         <w:tblLook w:firstRow="1" w:lastRow="0" w:firstColumn="0" w:lastColumn="0" w:noHBand="0" w:noVBand="0" w:val="0020"/>
         <w:jc w:val="start"/>
-        <w:tblCaption w:val="表4 域随机化范围"/>
+        <w:tblCaption w:val="表5 域随机化范围"/>
         <w:tblBorders>
           <w:top w:val="single" w:sz="12" w:space="0" w:color="000000"/>
           <w:left w:val="nil"/>
@@ -6669,6 +8110,7 @@
           <w:p>
             <w:pPr>
               <w:pStyle w:val="Compact"/>
+              <w:keepNext/>
               <w:ind w:firstLine="0"/>
               <w:jc w:val="left"/>
             </w:pPr>
@@ -6690,6 +8132,7 @@
           <w:p>
             <w:pPr>
               <w:pStyle w:val="Compact"/>
+              <w:keepNext/>
               <w:ind w:firstLine="0"/>
               <w:jc w:val="left"/>
             </w:pPr>
@@ -6711,6 +8154,7 @@
           <w:p>
             <w:pPr>
               <w:pStyle w:val="Compact"/>
+              <w:keepNext/>
               <w:ind w:firstLine="0"/>
               <w:jc w:val="left"/>
             </w:pPr>
@@ -6732,6 +8176,7 @@
           <w:p>
             <w:pPr>
               <w:pStyle w:val="Compact"/>
+              <w:keepNext/>
               <w:ind w:firstLine="0"/>
               <w:jc w:val="left"/>
             </w:pPr>
@@ -6751,6 +8196,7 @@
           <w:p>
             <w:pPr>
               <w:pStyle w:val="Compact"/>
+              <w:keepNext/>
               <w:ind w:firstLine="0"/>
               <w:jc w:val="left"/>
             </w:pPr>
@@ -6767,6 +8213,7 @@
           <w:p>
             <w:pPr>
               <w:pStyle w:val="Compact"/>
+              <w:keepNext/>
               <w:ind w:firstLine="0"/>
               <w:jc w:val="left"/>
             </w:pPr>
@@ -6783,6 +8230,7 @@
           <w:p>
             <w:pPr>
               <w:pStyle w:val="Compact"/>
+              <w:keepNext/>
               <w:ind w:firstLine="0"/>
               <w:jc w:val="left"/>
             </w:pPr>
@@ -6799,6 +8247,7 @@
           <w:p>
             <w:pPr>
               <w:pStyle w:val="Compact"/>
+              <w:keepNext/>
               <w:ind w:firstLine="0"/>
               <w:jc w:val="left"/>
             </w:pPr>
@@ -6817,6 +8266,7 @@
           <w:p>
             <w:pPr>
               <w:pStyle w:val="Compact"/>
+              <w:keepNext/>
               <w:ind w:firstLine="0"/>
               <w:jc w:val="left"/>
             </w:pPr>
@@ -6833,6 +8283,7 @@
           <w:p>
             <w:pPr>
               <w:pStyle w:val="Compact"/>
+              <w:keepNext/>
               <w:ind w:firstLine="0"/>
               <w:jc w:val="left"/>
             </w:pPr>
@@ -6849,6 +8300,7 @@
           <w:p>
             <w:pPr>
               <w:pStyle w:val="Compact"/>
+              <w:keepNext/>
               <w:ind w:firstLine="0"/>
               <w:jc w:val="left"/>
             </w:pPr>
@@ -6865,6 +8317,7 @@
           <w:p>
             <w:pPr>
               <w:pStyle w:val="Compact"/>
+              <w:keepNext/>
               <w:ind w:firstLine="0"/>
               <w:jc w:val="left"/>
             </w:pPr>
@@ -6883,6 +8336,7 @@
           <w:p>
             <w:pPr>
               <w:pStyle w:val="Compact"/>
+              <w:keepNext/>
               <w:ind w:firstLine="0"/>
               <w:jc w:val="left"/>
             </w:pPr>
@@ -6899,6 +8353,7 @@
           <w:p>
             <w:pPr>
               <w:pStyle w:val="Compact"/>
+              <w:keepNext/>
               <w:ind w:firstLine="0"/>
               <w:jc w:val="left"/>
             </w:pPr>
@@ -6915,6 +8370,7 @@
           <w:p>
             <w:pPr>
               <w:pStyle w:val="Compact"/>
+              <w:keepNext/>
               <w:ind w:firstLine="0"/>
               <w:jc w:val="left"/>
             </w:pPr>
@@ -6931,6 +8387,7 @@
           <w:p>
             <w:pPr>
               <w:pStyle w:val="Compact"/>
+              <w:keepNext/>
               <w:ind w:firstLine="0"/>
               <w:jc w:val="left"/>
             </w:pPr>
@@ -7026,15 +8483,16 @@
         <w:t xml:space="preserve"> </w:t>
       </w:r>
       <w:r>
-        <w:t xml:space="preserve">主要超参数见表5。</w:t>
+        <w:t xml:space="preserve">主要超参数见表6。</w:t>
       </w:r>
     </w:p>
     <w:p>
       <w:pPr>
         <w:pStyle w:val="TableCaption"/>
+        <w:keepNext/>
       </w:pPr>
       <w:r>
-        <w:t xml:space="preserve">表5 主要训练参数</w:t>
+        <w:t xml:space="preserve">表6 主要训练参数</w:t>
       </w:r>
     </w:p>
     <w:tbl>
@@ -7042,7 +8500,7 @@
         <w:tblW w:type="pct" w:w="5000"/>
         <w:tblLook w:firstRow="1" w:lastRow="0" w:firstColumn="0" w:lastColumn="0" w:noHBand="0" w:noVBand="0" w:val="0020"/>
         <w:jc w:val="start"/>
-        <w:tblCaption w:val="表5 主要训练参数"/>
+        <w:tblCaption w:val="表6 主要训练参数"/>
         <w:tblBorders>
           <w:top w:val="single" w:sz="12" w:space="0" w:color="000000"/>
           <w:left w:val="nil"/>
@@ -7072,6 +8530,7 @@
           <w:p>
             <w:pPr>
               <w:pStyle w:val="Compact"/>
+              <w:keepNext/>
               <w:ind w:firstLine="0"/>
               <w:jc w:val="left"/>
             </w:pPr>
@@ -7093,6 +8552,7 @@
           <w:p>
             <w:pPr>
               <w:pStyle w:val="Compact"/>
+              <w:keepNext/>
               <w:ind w:firstLine="0"/>
               <w:jc w:val="left"/>
             </w:pPr>
@@ -7114,6 +8574,7 @@
           <w:p>
             <w:pPr>
               <w:pStyle w:val="Compact"/>
+              <w:keepNext/>
               <w:ind w:firstLine="0"/>
               <w:jc w:val="left"/>
             </w:pPr>
@@ -7135,6 +8596,7 @@
           <w:p>
             <w:pPr>
               <w:pStyle w:val="Compact"/>
+              <w:keepNext/>
               <w:ind w:firstLine="0"/>
               <w:jc w:val="left"/>
             </w:pPr>
@@ -7154,6 +8616,7 @@
           <w:p>
             <w:pPr>
               <w:pStyle w:val="Compact"/>
+              <w:keepNext/>
               <w:ind w:firstLine="0"/>
               <w:jc w:val="left"/>
             </w:pPr>
@@ -7170,6 +8633,7 @@
           <w:p>
             <w:pPr>
               <w:pStyle w:val="Compact"/>
+              <w:keepNext/>
               <w:ind w:firstLine="0"/>
               <w:jc w:val="left"/>
             </w:pPr>
@@ -7186,6 +8650,7 @@
           <w:p>
             <w:pPr>
               <w:pStyle w:val="Compact"/>
+              <w:keepNext/>
               <w:ind w:firstLine="0"/>
               <w:jc w:val="left"/>
             </w:pPr>
@@ -7202,6 +8667,7 @@
           <w:p>
             <w:pPr>
               <w:pStyle w:val="Compact"/>
+              <w:keepNext/>
               <w:ind w:firstLine="0"/>
               <w:jc w:val="left"/>
             </w:pPr>
@@ -7220,6 +8686,7 @@
           <w:p>
             <w:pPr>
               <w:pStyle w:val="Compact"/>
+              <w:keepNext/>
               <w:ind w:firstLine="0"/>
               <w:jc w:val="left"/>
             </w:pPr>
@@ -7236,6 +8703,7 @@
           <w:p>
             <w:pPr>
               <w:pStyle w:val="Compact"/>
+              <w:keepNext/>
               <w:ind w:firstLine="0"/>
               <w:jc w:val="left"/>
             </w:pPr>
@@ -7252,6 +8720,7 @@
           <w:p>
             <w:pPr>
               <w:pStyle w:val="Compact"/>
+              <w:keepNext/>
               <w:ind w:firstLine="0"/>
               <w:jc w:val="left"/>
             </w:pPr>
@@ -7268,6 +8737,7 @@
           <w:p>
             <w:pPr>
               <w:pStyle w:val="Compact"/>
+              <w:keepNext/>
               <w:ind w:firstLine="0"/>
               <w:jc w:val="left"/>
             </w:pPr>
@@ -7286,6 +8756,7 @@
           <w:p>
             <w:pPr>
               <w:pStyle w:val="Compact"/>
+              <w:keepNext/>
               <w:ind w:firstLine="0"/>
               <w:jc w:val="left"/>
             </w:pPr>
@@ -7302,6 +8773,7 @@
           <w:p>
             <w:pPr>
               <w:pStyle w:val="Compact"/>
+              <w:keepNext/>
               <w:ind w:firstLine="0"/>
               <w:jc w:val="left"/>
             </w:pPr>
@@ -7318,6 +8790,7 @@
           <w:p>
             <w:pPr>
               <w:pStyle w:val="Compact"/>
+              <w:keepNext/>
               <w:ind w:firstLine="0"/>
               <w:jc w:val="left"/>
             </w:pPr>
@@ -7345,6 +8818,7 @@
           <w:p>
             <w:pPr>
               <w:pStyle w:val="Compact"/>
+              <w:keepNext/>
               <w:ind w:firstLine="0"/>
               <w:jc w:val="left"/>
             </w:pPr>
@@ -7363,6 +8837,7 @@
           <w:p>
             <w:pPr>
               <w:pStyle w:val="Compact"/>
+              <w:keepNext/>
               <w:ind w:firstLine="0"/>
               <w:jc w:val="left"/>
             </w:pPr>
@@ -7390,6 +8865,7 @@
           <w:p>
             <w:pPr>
               <w:pStyle w:val="Compact"/>
+              <w:keepNext/>
               <w:ind w:firstLine="0"/>
               <w:jc w:val="left"/>
             </w:pPr>
@@ -7406,6 +8882,7 @@
           <w:p>
             <w:pPr>
               <w:pStyle w:val="Compact"/>
+              <w:keepNext/>
               <w:ind w:firstLine="0"/>
               <w:jc w:val="left"/>
             </w:pPr>
@@ -7433,6 +8910,7 @@
           <w:p>
             <w:pPr>
               <w:pStyle w:val="Compact"/>
+              <w:keepNext/>
               <w:ind w:firstLine="0"/>
               <w:jc w:val="left"/>
             </w:pPr>
@@ -7451,6 +8929,7 @@
           <w:p>
             <w:pPr>
               <w:pStyle w:val="Compact"/>
+              <w:keepNext/>
               <w:ind w:firstLine="0"/>
               <w:jc w:val="left"/>
             </w:pPr>
@@ -7467,6 +8946,7 @@
           <w:p>
             <w:pPr>
               <w:pStyle w:val="Compact"/>
+              <w:keepNext/>
               <w:ind w:firstLine="0"/>
               <w:jc w:val="left"/>
             </w:pPr>
@@ -7483,6 +8963,7 @@
           <w:p>
             <w:pPr>
               <w:pStyle w:val="Compact"/>
+              <w:keepNext/>
               <w:ind w:firstLine="0"/>
               <w:jc w:val="left"/>
             </w:pPr>
@@ -7499,6 +8980,7 @@
           <w:p>
             <w:pPr>
               <w:pStyle w:val="Compact"/>
+              <w:keepNext/>
               <w:ind w:firstLine="0"/>
               <w:jc w:val="left"/>
             </w:pPr>
@@ -7664,7 +9146,7 @@
         <w:pStyle w:val="BodyText"/>
       </w:pPr>
       <w:r>
-        <w:t xml:space="preserve">24步采样结束后共得到98304条样本。先用Critic对最后一个状态的价值做自举，按广义优势估计[10]计算每一步的优势：</w:t>
+        <w:t xml:space="preserve">24步采样结束后共得到98304条样本。先用Critic对最后一个状态的价值做自举，按广义优势估计（GAE）计算每一步的优势：</w:t>
       </w:r>
     </w:p>
     <w:p>
@@ -8233,11 +9715,19 @@
           </m:e>
           <m:sub>
             <m:r>
-              <m:rPr>
-                <m:nor/>
-                <m:sty m:val="p"/>
-              </m:rPr>
-              <m:t>value</m:t>
+              <m:t>v</m:t>
+            </m:r>
+            <m:r>
+              <m:t>a</m:t>
+            </m:r>
+            <m:r>
+              <m:t>l</m:t>
+            </m:r>
+            <m:r>
+              <m:t>u</m:t>
+            </m:r>
+            <m:r>
+              <m:t>e</m:t>
             </m:r>
           </m:sub>
         </m:sSub>
@@ -8306,11 +9796,10 @@
           </m:e>
           <m:sub>
             <m:r>
-              <m:rPr>
-                <m:nor/>
-                <m:sty m:val="p"/>
-              </m:rPr>
-              <m:t>lb</m:t>
+              <m:t>l</m:t>
+            </m:r>
+            <m:r>
+              <m:t>b</m:t>
             </m:r>
           </m:sub>
         </m:sSub>
@@ -8437,11 +9926,13 @@
               </m:e>
               <m:sub>
                 <m:r>
-                  <m:rPr>
-                    <m:nor/>
-                    <m:sty m:val="p"/>
-                  </m:rPr>
-                  <m:t>old</m:t>
+                  <m:t>o</m:t>
+                </m:r>
+                <m:r>
+                  <m:t>l</m:t>
+                </m:r>
+                <m:r>
+                  <m:t>d</m:t>
                 </m:r>
               </m:sub>
             </m:sSub>
@@ -8510,11 +10001,19 @@
           </m:e>
           <m:sub>
             <m:r>
-              <m:rPr>
-                <m:nor/>
-                <m:sty m:val="p"/>
-              </m:rPr>
-              <m:t>value</m:t>
+              <m:t>v</m:t>
+            </m:r>
+            <m:r>
+              <m:t>a</m:t>
+            </m:r>
+            <m:r>
+              <m:t>l</m:t>
+            </m:r>
+            <m:r>
+              <m:t>u</m:t>
+            </m:r>
+            <m:r>
+              <m:t>e</m:t>
             </m:r>
           </m:sub>
         </m:sSub>
@@ -8564,7 +10063,7 @@
         <w:pStyle w:val="BodyText"/>
       </w:pPr>
       <w:r>
-        <w:t xml:space="preserve">模型导出为两个ONNX网络，接口见表6。导出时共享状态</w:t>
+        <w:t xml:space="preserve">模型导出为两个ONNX网络，接口见表7。导出时共享状态</w:t>
       </w:r>
       <w:r>
         <w:t xml:space="preserve"> </w:t>
@@ -8592,11 +10091,16 @@
           </m:e>
           <m:sub>
             <m:r>
-              <m:rPr>
-                <m:nor/>
-                <m:sty m:val="p"/>
-              </m:rPr>
-              <m:t>next</m:t>
+              <m:t>n</m:t>
+            </m:r>
+            <m:r>
+              <m:t>e</m:t>
+            </m:r>
+            <m:r>
+              <m:t>x</m:t>
+            </m:r>
+            <m:r>
+              <m:t>t</m:t>
             </m:r>
           </m:sub>
         </m:sSub>
@@ -8611,9 +10115,10 @@
     <w:p>
       <w:pPr>
         <w:pStyle w:val="TableCaption"/>
+        <w:keepNext/>
       </w:pPr>
       <w:r>
-        <w:t xml:space="preserve">表6 部署模型接口</w:t>
+        <w:t xml:space="preserve">表7 部署模型接口</w:t>
       </w:r>
     </w:p>
     <w:tbl>
@@ -8621,7 +10126,7 @@
         <w:tblW w:type="pct" w:w="5000"/>
         <w:tblLook w:firstRow="1" w:lastRow="0" w:firstColumn="0" w:lastColumn="0" w:noHBand="0" w:noVBand="0" w:val="0020"/>
         <w:jc w:val="start"/>
-        <w:tblCaption w:val="表6 部署模型接口"/>
+        <w:tblCaption w:val="表7 部署模型接口"/>
         <w:tblBorders>
           <w:top w:val="single" w:sz="12" w:space="0" w:color="000000"/>
           <w:left w:val="nil"/>
@@ -8651,6 +10156,7 @@
           <w:p>
             <w:pPr>
               <w:pStyle w:val="Compact"/>
+              <w:keepNext/>
               <w:ind w:firstLine="0"/>
               <w:jc w:val="left"/>
             </w:pPr>
@@ -8672,6 +10178,7 @@
           <w:p>
             <w:pPr>
               <w:pStyle w:val="Compact"/>
+              <w:keepNext/>
               <w:ind w:firstLine="0"/>
               <w:jc w:val="left"/>
             </w:pPr>
@@ -8693,6 +10200,7 @@
           <w:p>
             <w:pPr>
               <w:pStyle w:val="Compact"/>
+              <w:keepNext/>
               <w:ind w:firstLine="0"/>
               <w:jc w:val="left"/>
             </w:pPr>
@@ -8714,6 +10222,7 @@
           <w:p>
             <w:pPr>
               <w:pStyle w:val="Compact"/>
+              <w:keepNext/>
               <w:ind w:firstLine="0"/>
               <w:jc w:val="left"/>
             </w:pPr>
@@ -8733,6 +10242,7 @@
           <w:p>
             <w:pPr>
               <w:pStyle w:val="Compact"/>
+              <w:keepNext/>
               <w:ind w:firstLine="0"/>
               <w:jc w:val="left"/>
             </w:pPr>
@@ -8749,6 +10259,7 @@
           <w:p>
             <w:pPr>
               <w:pStyle w:val="Compact"/>
+              <w:keepNext/>
               <w:ind w:firstLine="0"/>
               <w:jc w:val="left"/>
             </w:pPr>
@@ -8765,6 +10276,7 @@
           <w:p>
             <w:pPr>
               <w:pStyle w:val="Compact"/>
+              <w:keepNext/>
               <w:ind w:firstLine="0"/>
               <w:jc w:val="left"/>
             </w:pPr>
@@ -8781,6 +10293,7 @@
           <w:p>
             <w:pPr>
               <w:pStyle w:val="Compact"/>
+              <w:keepNext/>
               <w:ind w:firstLine="0"/>
               <w:jc w:val="left"/>
             </w:pPr>
@@ -8878,137 +10391,7 @@
       </w:r>
     </w:p>
     <w:bookmarkEnd w:id="42"/>
-    <w:bookmarkStart w:id="43" w:name="参考文献"/>
-    <w:p>
-      <w:pPr>
-        <w:pStyle w:val="Heading2"/>
-      </w:pPr>
-      <w:r>
-        <w:t xml:space="preserve">参考文献</w:t>
-      </w:r>
-    </w:p>
-    <w:p>
-      <w:pPr>
-        <w:pStyle w:val="FirstParagraph"/>
-        <w:ind w:hanging="420" w:left="420"/>
-      </w:pPr>
-      <w:r>
-        <w:rPr>
-          <w:sz w:val="21"/>
-        </w:rPr>
-        <w:t xml:space="preserve">[1] PRISM: Resilient Quadruped Parkour under Impaired Sensing and Motion Constraints.</w:t>
-      </w:r>
-    </w:p>
-    <w:p>
-      <w:pPr>
-        <w:pStyle w:val="BodyText"/>
-        <w:ind w:hanging="420" w:left="420"/>
-      </w:pPr>
-      <w:r>
-        <w:rPr>
-          <w:sz w:val="21"/>
-        </w:rPr>
-        <w:t xml:space="preserve">[2] Makoviychuk V, Wawrzyniak L, Guo Y, et al. Isaac Gym: High performance GPU-based physics simulation for robot learning[C]. NeurIPS Datasets and Benchmarks, 2021.</w:t>
-      </w:r>
-    </w:p>
-    <w:p>
-      <w:pPr>
-        <w:pStyle w:val="BodyText"/>
-        <w:ind w:hanging="420" w:left="420"/>
-      </w:pPr>
-      <w:r>
-        <w:rPr>
-          <w:sz w:val="21"/>
-        </w:rPr>
-        <w:t xml:space="preserve">[3] Rudin N, Hoeller D, Reist P, et al. Learning to walk in minutes using massively parallel deep reinforcement learning[C]. Conference on Robot Learning, 2022: 91-100.</w:t>
-      </w:r>
-    </w:p>
-    <w:p>
-      <w:pPr>
-        <w:pStyle w:val="BodyText"/>
-        <w:ind w:hanging="420" w:left="420"/>
-      </w:pPr>
-      <w:r>
-        <w:rPr>
-          <w:sz w:val="21"/>
-        </w:rPr>
-        <w:t xml:space="preserve">[4] Schulman J, Wolski F, Dhariwal P, et al. Proximal policy optimization algorithms[J]. arXiv preprint arXiv:1707.06347, 2017.</w:t>
-      </w:r>
-    </w:p>
-    <w:p>
-      <w:pPr>
-        <w:pStyle w:val="BodyText"/>
-        <w:ind w:hanging="420" w:left="420"/>
-      </w:pPr>
-      <w:r>
-        <w:rPr>
-          <w:sz w:val="21"/>
-        </w:rPr>
-        <w:t xml:space="preserve">[5] Vaswani A, Shazeer N, Parmar N, et al. Attention is all you need[C]. Advances in Neural Information Processing Systems, 2017.</w:t>
-      </w:r>
-    </w:p>
-    <w:p>
-      <w:pPr>
-        <w:pStyle w:val="BodyText"/>
-        <w:ind w:hanging="420" w:left="420"/>
-      </w:pPr>
-      <w:r>
-        <w:rPr>
-          <w:sz w:val="21"/>
-        </w:rPr>
-        <w:t xml:space="preserve">[6] Cho K, van Merriënboer B, Gulcehre C, et al. Learning phrase representations using RNN encoder-decoder for statistical machine translation[C]. EMNLP, 2014.</w:t>
-      </w:r>
-    </w:p>
-    <w:p>
-      <w:pPr>
-        <w:pStyle w:val="BodyText"/>
-        <w:ind w:hanging="420" w:left="420"/>
-      </w:pPr>
-      <w:r>
-        <w:rPr>
-          <w:sz w:val="21"/>
-        </w:rPr>
-        <w:t xml:space="preserve">[7] Caron M, Misra I, Mairal J, et al. Unsupervised learning of visual features by contrasting cluster assignments[C]. Advances in Neural Information Processing Systems, 2020.</w:t>
-      </w:r>
-    </w:p>
-    <w:p>
-      <w:pPr>
-        <w:pStyle w:val="BodyText"/>
-        <w:ind w:hanging="420" w:left="420"/>
-      </w:pPr>
-      <w:r>
-        <w:rPr>
-          <w:sz w:val="21"/>
-        </w:rPr>
-        <w:t xml:space="preserve">[8] Shazeer N, Mirhoseini A, Maziarz K, et al. Outrageously large neural networks: The sparsely-gated mixture-of-experts layer[C]. ICLR, 2017.</w:t>
-      </w:r>
-    </w:p>
-    <w:p>
-      <w:pPr>
-        <w:pStyle w:val="BodyText"/>
-        <w:ind w:hanging="420" w:left="420"/>
-      </w:pPr>
-      <w:r>
-        <w:rPr>
-          <w:sz w:val="21"/>
-        </w:rPr>
-        <w:t xml:space="preserve">[9] Pinto L, Andrychowicz M, Welinder P, et al. Asymmetric actor critic for image-based robot learning[C]. Robotics: Science and Systems, 2018.</w:t>
-      </w:r>
-    </w:p>
-    <w:p>
-      <w:pPr>
-        <w:pStyle w:val="BodyText"/>
-        <w:ind w:hanging="420" w:left="420"/>
-      </w:pPr>
-      <w:r>
-        <w:rPr>
-          <w:sz w:val="21"/>
-        </w:rPr>
-        <w:t xml:space="preserve">[10] Schulman J, Moritz P, Levine S, et al. High-dimensional continuous control using generalized advantage estimation[C]. ICLR, 2016.</w:t>
-      </w:r>
-    </w:p>
     <w:bookmarkEnd w:id="43"/>
-    <w:bookmarkEnd w:id="44"/>
     <w:sectPr>
       <w:pgSz w:h="16838" w:w="11906"/>
       <w:pgMar w:bottom="1440" w:left="1417" w:right="1417" w:top="1440"/>

</xml_diff>